<commit_message>
Add band transfer analysis to TSAC section draft
Tables D1 (band composition) and D2 (band allocation changes vs IUSAF)
show that Band 2 (59 Parties, 31 LDCs) bears the largest loss while
Band 6 (China) receives the largest gain at every TSAC level. Adds
political framing of the transfer implications for developing countries.

Co-authored-by: factory-droid[bot] <138933559+factory-droid[bot]@users.noreply.github.com>
</commit_message>
<xml_diff>
--- a/model-tables/iusaf-tsac-section-draft.docx
+++ b/model-tables/iusaf-tsac-section-draft.docx
@@ -4217,6 +4217,2021 @@
       </w:pPr>
       <w:r>
         <w:t>The ranking trajectory shows that the Gini coefficient reaches its minimum at TSAC = 2.5% (Gini = 0.0886) while band order is still preserved. Beyond the band-order overturn at TSAC = 3.0%, the Gini continues to decline briefly before rising again as TSAC dominates. The policy-relevant range lies between the strict point (TSAC = 1.5%) and the Gini-minimum (TSAC = 2.5%), with the band-order boundary at TSAC = 3.0% as the structural ceiling.</w:t>
+      </w:r>
+    </w:p>
+    <w:p>
+      <w:pPr>
+        <w:pStyle w:val="Heading2"/>
+      </w:pPr>
+      <w:r>
+        <w:rPr>
+          <w:rFonts w:ascii="Times New Roman" w:hAnsi="Times New Roman"/>
+        </w:rPr>
+        <w:t>Band Transfer Analysis: Who Gains and Who Loses</w:t>
+      </w:r>
+    </w:p>
+    <w:p>
+      <w:pPr>
+        <w:spacing w:after="120"/>
+      </w:pPr>
+      <w:r>
+        <w:t>A critical consideration for Parties is how TSAC reallocates funds between bands. Table D shows the composition of each IUSAF band under the pure IUSAF baseline. Band 2 is the largest group with 59 eligible Parties, including 31 LDCs and 11 SIDS. Band 6 contains a single upper-middle-income Party (China).</w:t>
+      </w:r>
+    </w:p>
+    <w:tbl>
+      <w:tblPr>
+        <w:tblStyle w:val="TableGrid"/>
+        <w:tblW w:type="auto" w:w="0"/>
+        <w:jc w:val="center"/>
+        <w:tblLook w:firstColumn="1" w:firstRow="1" w:lastColumn="0" w:lastRow="0" w:noHBand="0" w:noVBand="1" w:val="04A0"/>
+      </w:tblPr>
+      <w:tblGrid>
+        <w:gridCol w:w="1344"/>
+        <w:gridCol w:w="1344"/>
+        <w:gridCol w:w="1344"/>
+        <w:gridCol w:w="1344"/>
+        <w:gridCol w:w="1344"/>
+        <w:gridCol w:w="1344"/>
+        <w:gridCol w:w="1344"/>
+      </w:tblGrid>
+      <w:tr>
+        <w:tc>
+          <w:tcPr>
+            <w:tcW w:type="dxa" w:w="1701"/>
+            <w:shd w:fill="D9D9D9"/>
+          </w:tcPr>
+          <w:p>
+            <w:pPr>
+              <w:jc w:val="center"/>
+            </w:pPr>
+            <w:r/>
+            <w:r>
+              <w:rPr>
+                <w:rFonts w:ascii="Times New Roman" w:hAnsi="Times New Roman"/>
+                <w:b/>
+                <w:sz w:val="17"/>
+              </w:rPr>
+              <w:t>IUSAF Band</w:t>
+            </w:r>
+          </w:p>
+        </w:tc>
+        <w:tc>
+          <w:tcPr>
+            <w:tcW w:type="dxa" w:w="850"/>
+            <w:shd w:fill="D9D9D9"/>
+          </w:tcPr>
+          <w:p>
+            <w:pPr>
+              <w:jc w:val="center"/>
+            </w:pPr>
+            <w:r/>
+            <w:r>
+              <w:rPr>
+                <w:rFonts w:ascii="Times New Roman" w:hAnsi="Times New Roman"/>
+                <w:b/>
+                <w:sz w:val="17"/>
+              </w:rPr>
+              <w:t>Parties</w:t>
+            </w:r>
+          </w:p>
+        </w:tc>
+        <w:tc>
+          <w:tcPr>
+            <w:tcW w:type="dxa" w:w="567"/>
+            <w:shd w:fill="D9D9D9"/>
+          </w:tcPr>
+          <w:p>
+            <w:pPr>
+              <w:jc w:val="center"/>
+            </w:pPr>
+            <w:r/>
+            <w:r>
+              <w:rPr>
+                <w:rFonts w:ascii="Times New Roman" w:hAnsi="Times New Roman"/>
+                <w:b/>
+                <w:sz w:val="17"/>
+              </w:rPr>
+              <w:t>LDCs</w:t>
+            </w:r>
+          </w:p>
+        </w:tc>
+        <w:tc>
+          <w:tcPr>
+            <w:tcW w:type="dxa" w:w="567"/>
+            <w:shd w:fill="D9D9D9"/>
+          </w:tcPr>
+          <w:p>
+            <w:pPr>
+              <w:jc w:val="center"/>
+            </w:pPr>
+            <w:r/>
+            <w:r>
+              <w:rPr>
+                <w:rFonts w:ascii="Times New Roman" w:hAnsi="Times New Roman"/>
+                <w:b/>
+                <w:sz w:val="17"/>
+              </w:rPr>
+              <w:t>SIDS</w:t>
+            </w:r>
+          </w:p>
+        </w:tc>
+        <w:tc>
+          <w:tcPr>
+            <w:tcW w:type="dxa" w:w="2835"/>
+            <w:shd w:fill="D9D9D9"/>
+          </w:tcPr>
+          <w:p>
+            <w:pPr>
+              <w:jc w:val="center"/>
+            </w:pPr>
+            <w:r/>
+            <w:r>
+              <w:rPr>
+                <w:rFonts w:ascii="Times New Roman" w:hAnsi="Times New Roman"/>
+                <w:b/>
+                <w:sz w:val="17"/>
+              </w:rPr>
+              <w:t>Income distribution</w:t>
+            </w:r>
+          </w:p>
+        </w:tc>
+        <w:tc>
+          <w:tcPr>
+            <w:tcW w:type="dxa" w:w="1134"/>
+            <w:shd w:fill="D9D9D9"/>
+          </w:tcPr>
+          <w:p>
+            <w:pPr>
+              <w:jc w:val="center"/>
+            </w:pPr>
+            <w:r/>
+            <w:r>
+              <w:rPr>
+                <w:rFonts w:ascii="Times New Roman" w:hAnsi="Times New Roman"/>
+                <w:b/>
+                <w:sz w:val="17"/>
+              </w:rPr>
+              <w:t>IUSAF total</w:t>
+            </w:r>
+            <w:r>
+              <w:br/>
+            </w:r>
+            <w:r>
+              <w:rPr>
+                <w:rFonts w:ascii="Times New Roman" w:hAnsi="Times New Roman"/>
+                <w:b/>
+                <w:sz w:val="17"/>
+              </w:rPr>
+              <w:t>(USD M)</w:t>
+            </w:r>
+          </w:p>
+        </w:tc>
+        <w:tc>
+          <w:tcPr>
+            <w:tcW w:type="dxa" w:w="1134"/>
+            <w:shd w:fill="D9D9D9"/>
+          </w:tcPr>
+          <w:p>
+            <w:pPr>
+              <w:jc w:val="center"/>
+            </w:pPr>
+            <w:r/>
+            <w:r>
+              <w:rPr>
+                <w:rFonts w:ascii="Times New Roman" w:hAnsi="Times New Roman"/>
+                <w:b/>
+                <w:sz w:val="17"/>
+              </w:rPr>
+              <w:t>Per-Party</w:t>
+            </w:r>
+            <w:r>
+              <w:br/>
+            </w:r>
+            <w:r>
+              <w:rPr>
+                <w:rFonts w:ascii="Times New Roman" w:hAnsi="Times New Roman"/>
+                <w:b/>
+                <w:sz w:val="17"/>
+              </w:rPr>
+              <w:t>(USD M)</w:t>
+            </w:r>
+          </w:p>
+        </w:tc>
+      </w:tr>
+      <w:tr>
+        <w:tc>
+          <w:tcPr>
+            <w:tcW w:type="dxa" w:w="1701"/>
+          </w:tcPr>
+          <w:p>
+            <w:pPr>
+              <w:jc w:val="center"/>
+            </w:pPr>
+            <w:r/>
+            <w:r>
+              <w:rPr>
+                <w:rFonts w:ascii="Times New Roman" w:hAnsi="Times New Roman"/>
+                <w:sz w:val="17"/>
+              </w:rPr>
+              <w:t>Band 1 (≤0.001%)</w:t>
+            </w:r>
+          </w:p>
+        </w:tc>
+        <w:tc>
+          <w:tcPr>
+            <w:tcW w:type="dxa" w:w="850"/>
+          </w:tcPr>
+          <w:p>
+            <w:pPr>
+              <w:jc w:val="center"/>
+            </w:pPr>
+            <w:r/>
+            <w:r>
+              <w:rPr>
+                <w:rFonts w:ascii="Times New Roman" w:hAnsi="Times New Roman"/>
+                <w:sz w:val="17"/>
+              </w:rPr>
+              <w:t>31</w:t>
+            </w:r>
+          </w:p>
+        </w:tc>
+        <w:tc>
+          <w:tcPr>
+            <w:tcW w:type="dxa" w:w="567"/>
+          </w:tcPr>
+          <w:p>
+            <w:pPr>
+              <w:jc w:val="center"/>
+            </w:pPr>
+            <w:r/>
+            <w:r>
+              <w:rPr>
+                <w:rFonts w:ascii="Times New Roman" w:hAnsi="Times New Roman"/>
+                <w:sz w:val="17"/>
+              </w:rPr>
+              <w:t>13</w:t>
+            </w:r>
+          </w:p>
+        </w:tc>
+        <w:tc>
+          <w:tcPr>
+            <w:tcW w:type="dxa" w:w="567"/>
+          </w:tcPr>
+          <w:p>
+            <w:pPr>
+              <w:jc w:val="center"/>
+            </w:pPr>
+            <w:r/>
+            <w:r>
+              <w:rPr>
+                <w:rFonts w:ascii="Times New Roman" w:hAnsi="Times New Roman"/>
+                <w:sz w:val="17"/>
+              </w:rPr>
+              <w:t>22</w:t>
+            </w:r>
+          </w:p>
+        </w:tc>
+        <w:tc>
+          <w:tcPr>
+            <w:tcW w:type="dxa" w:w="2835"/>
+          </w:tcPr>
+          <w:p>
+            <w:pPr>
+              <w:jc w:val="center"/>
+            </w:pPr>
+            <w:r/>
+            <w:r>
+              <w:rPr>
+                <w:rFonts w:ascii="Times New Roman" w:hAnsi="Times New Roman"/>
+                <w:sz w:val="17"/>
+              </w:rPr>
+              <w:t>7 Low, 10 Lower-mid, 9 Upper-mid, 5 High</w:t>
+            </w:r>
+          </w:p>
+        </w:tc>
+        <w:tc>
+          <w:tcPr>
+            <w:tcW w:type="dxa" w:w="1134"/>
+          </w:tcPr>
+          <w:p>
+            <w:pPr>
+              <w:jc w:val="center"/>
+            </w:pPr>
+            <w:r/>
+            <w:r>
+              <w:rPr>
+                <w:rFonts w:ascii="Times New Roman" w:hAnsi="Times New Roman"/>
+                <w:sz w:val="17"/>
+              </w:rPr>
+              <w:t>264.28</w:t>
+            </w:r>
+          </w:p>
+        </w:tc>
+        <w:tc>
+          <w:tcPr>
+            <w:tcW w:type="dxa" w:w="1134"/>
+          </w:tcPr>
+          <w:p>
+            <w:pPr>
+              <w:jc w:val="left"/>
+            </w:pPr>
+            <w:r/>
+            <w:r>
+              <w:rPr>
+                <w:rFonts w:ascii="Times New Roman" w:hAnsi="Times New Roman"/>
+                <w:sz w:val="17"/>
+              </w:rPr>
+              <w:t>8.53</w:t>
+            </w:r>
+          </w:p>
+        </w:tc>
+      </w:tr>
+      <w:tr>
+        <w:tc>
+          <w:tcPr>
+            <w:tcW w:type="dxa" w:w="1701"/>
+          </w:tcPr>
+          <w:p>
+            <w:pPr>
+              <w:jc w:val="center"/>
+            </w:pPr>
+            <w:r/>
+            <w:r>
+              <w:rPr>
+                <w:rFonts w:ascii="Times New Roman" w:hAnsi="Times New Roman"/>
+                <w:sz w:val="17"/>
+              </w:rPr>
+              <w:t>Band 2 (0.001–0.01%)</w:t>
+            </w:r>
+          </w:p>
+        </w:tc>
+        <w:tc>
+          <w:tcPr>
+            <w:tcW w:type="dxa" w:w="850"/>
+          </w:tcPr>
+          <w:p>
+            <w:pPr>
+              <w:jc w:val="center"/>
+            </w:pPr>
+            <w:r/>
+            <w:r>
+              <w:rPr>
+                <w:rFonts w:ascii="Times New Roman" w:hAnsi="Times New Roman"/>
+                <w:sz w:val="17"/>
+              </w:rPr>
+              <w:t>59</w:t>
+            </w:r>
+          </w:p>
+        </w:tc>
+        <w:tc>
+          <w:tcPr>
+            <w:tcW w:type="dxa" w:w="567"/>
+          </w:tcPr>
+          <w:p>
+            <w:pPr>
+              <w:jc w:val="center"/>
+            </w:pPr>
+            <w:r/>
+            <w:r>
+              <w:rPr>
+                <w:rFonts w:ascii="Times New Roman" w:hAnsi="Times New Roman"/>
+                <w:sz w:val="17"/>
+              </w:rPr>
+              <w:t>31</w:t>
+            </w:r>
+          </w:p>
+        </w:tc>
+        <w:tc>
+          <w:tcPr>
+            <w:tcW w:type="dxa" w:w="567"/>
+          </w:tcPr>
+          <w:p>
+            <w:pPr>
+              <w:jc w:val="center"/>
+            </w:pPr>
+            <w:r/>
+            <w:r>
+              <w:rPr>
+                <w:rFonts w:ascii="Times New Roman" w:hAnsi="Times New Roman"/>
+                <w:sz w:val="17"/>
+              </w:rPr>
+              <w:t>11</w:t>
+            </w:r>
+          </w:p>
+        </w:tc>
+        <w:tc>
+          <w:tcPr>
+            <w:tcW w:type="dxa" w:w="2835"/>
+          </w:tcPr>
+          <w:p>
+            <w:pPr>
+              <w:jc w:val="center"/>
+            </w:pPr>
+            <w:r/>
+            <w:r>
+              <w:rPr>
+                <w:rFonts w:ascii="Times New Roman" w:hAnsi="Times New Roman"/>
+                <w:sz w:val="17"/>
+              </w:rPr>
+              <w:t>19 Low, 23 Lower-mid, 14 Upper-mid, 3 High</w:t>
+            </w:r>
+          </w:p>
+        </w:tc>
+        <w:tc>
+          <w:tcPr>
+            <w:tcW w:type="dxa" w:w="1134"/>
+          </w:tcPr>
+          <w:p>
+            <w:pPr>
+              <w:jc w:val="center"/>
+            </w:pPr>
+            <w:r/>
+            <w:r>
+              <w:rPr>
+                <w:rFonts w:ascii="Times New Roman" w:hAnsi="Times New Roman"/>
+                <w:sz w:val="17"/>
+              </w:rPr>
+              <w:t>435.92</w:t>
+            </w:r>
+          </w:p>
+        </w:tc>
+        <w:tc>
+          <w:tcPr>
+            <w:tcW w:type="dxa" w:w="1134"/>
+          </w:tcPr>
+          <w:p>
+            <w:pPr>
+              <w:jc w:val="left"/>
+            </w:pPr>
+            <w:r/>
+            <w:r>
+              <w:rPr>
+                <w:rFonts w:ascii="Times New Roman" w:hAnsi="Times New Roman"/>
+                <w:sz w:val="17"/>
+              </w:rPr>
+              <w:t>7.39</w:t>
+            </w:r>
+          </w:p>
+        </w:tc>
+      </w:tr>
+      <w:tr>
+        <w:tc>
+          <w:tcPr>
+            <w:tcW w:type="dxa" w:w="1701"/>
+          </w:tcPr>
+          <w:p>
+            <w:pPr>
+              <w:jc w:val="center"/>
+            </w:pPr>
+            <w:r/>
+            <w:r>
+              <w:rPr>
+                <w:rFonts w:ascii="Times New Roman" w:hAnsi="Times New Roman"/>
+                <w:sz w:val="17"/>
+              </w:rPr>
+              <w:t>Band 3 (0.01–0.1%)</w:t>
+            </w:r>
+          </w:p>
+        </w:tc>
+        <w:tc>
+          <w:tcPr>
+            <w:tcW w:type="dxa" w:w="850"/>
+          </w:tcPr>
+          <w:p>
+            <w:pPr>
+              <w:jc w:val="center"/>
+            </w:pPr>
+            <w:r/>
+            <w:r>
+              <w:rPr>
+                <w:rFonts w:ascii="Times New Roman" w:hAnsi="Times New Roman"/>
+                <w:sz w:val="17"/>
+              </w:rPr>
+              <w:t>30</w:t>
+            </w:r>
+          </w:p>
+        </w:tc>
+        <w:tc>
+          <w:tcPr>
+            <w:tcW w:type="dxa" w:w="567"/>
+          </w:tcPr>
+          <w:p>
+            <w:pPr>
+              <w:jc w:val="center"/>
+            </w:pPr>
+            <w:r/>
+            <w:r>
+              <w:rPr>
+                <w:rFonts w:ascii="Times New Roman" w:hAnsi="Times New Roman"/>
+                <w:sz w:val="17"/>
+              </w:rPr>
+              <w:t>0</w:t>
+            </w:r>
+          </w:p>
+        </w:tc>
+        <w:tc>
+          <w:tcPr>
+            <w:tcW w:type="dxa" w:w="567"/>
+          </w:tcPr>
+          <w:p>
+            <w:pPr>
+              <w:jc w:val="center"/>
+            </w:pPr>
+            <w:r/>
+            <w:r>
+              <w:rPr>
+                <w:rFonts w:ascii="Times New Roman" w:hAnsi="Times New Roman"/>
+                <w:sz w:val="17"/>
+              </w:rPr>
+              <w:t>4</w:t>
+            </w:r>
+          </w:p>
+        </w:tc>
+        <w:tc>
+          <w:tcPr>
+            <w:tcW w:type="dxa" w:w="2835"/>
+          </w:tcPr>
+          <w:p>
+            <w:pPr>
+              <w:jc w:val="center"/>
+            </w:pPr>
+            <w:r/>
+            <w:r>
+              <w:rPr>
+                <w:rFonts w:ascii="Times New Roman" w:hAnsi="Times New Roman"/>
+                <w:sz w:val="17"/>
+              </w:rPr>
+              <w:t>12 Lower-mid, 15 Upper-mid, 3 High</w:t>
+            </w:r>
+          </w:p>
+        </w:tc>
+        <w:tc>
+          <w:tcPr>
+            <w:tcW w:type="dxa" w:w="1134"/>
+          </w:tcPr>
+          <w:p>
+            <w:pPr>
+              <w:jc w:val="center"/>
+            </w:pPr>
+            <w:r/>
+            <w:r>
+              <w:rPr>
+                <w:rFonts w:ascii="Times New Roman" w:hAnsi="Times New Roman"/>
+                <w:sz w:val="17"/>
+              </w:rPr>
+              <w:t>187.55</w:t>
+            </w:r>
+          </w:p>
+        </w:tc>
+        <w:tc>
+          <w:tcPr>
+            <w:tcW w:type="dxa" w:w="1134"/>
+          </w:tcPr>
+          <w:p>
+            <w:pPr>
+              <w:jc w:val="left"/>
+            </w:pPr>
+            <w:r/>
+            <w:r>
+              <w:rPr>
+                <w:rFonts w:ascii="Times New Roman" w:hAnsi="Times New Roman"/>
+                <w:sz w:val="17"/>
+              </w:rPr>
+              <w:t>6.25</w:t>
+            </w:r>
+          </w:p>
+        </w:tc>
+      </w:tr>
+      <w:tr>
+        <w:tc>
+          <w:tcPr>
+            <w:tcW w:type="dxa" w:w="1701"/>
+          </w:tcPr>
+          <w:p>
+            <w:pPr>
+              <w:jc w:val="center"/>
+            </w:pPr>
+            <w:r/>
+            <w:r>
+              <w:rPr>
+                <w:rFonts w:ascii="Times New Roman" w:hAnsi="Times New Roman"/>
+                <w:sz w:val="17"/>
+              </w:rPr>
+              <w:t>Band 4 (0.1–1.0%)</w:t>
+            </w:r>
+          </w:p>
+        </w:tc>
+        <w:tc>
+          <w:tcPr>
+            <w:tcW w:type="dxa" w:w="850"/>
+          </w:tcPr>
+          <w:p>
+            <w:pPr>
+              <w:jc w:val="center"/>
+            </w:pPr>
+            <w:r/>
+            <w:r>
+              <w:rPr>
+                <w:rFonts w:ascii="Times New Roman" w:hAnsi="Times New Roman"/>
+                <w:sz w:val="17"/>
+              </w:rPr>
+              <w:t>18</w:t>
+            </w:r>
+          </w:p>
+        </w:tc>
+        <w:tc>
+          <w:tcPr>
+            <w:tcW w:type="dxa" w:w="567"/>
+          </w:tcPr>
+          <w:p>
+            <w:pPr>
+              <w:jc w:val="center"/>
+            </w:pPr>
+            <w:r/>
+            <w:r>
+              <w:rPr>
+                <w:rFonts w:ascii="Times New Roman" w:hAnsi="Times New Roman"/>
+                <w:sz w:val="17"/>
+              </w:rPr>
+              <w:t>0</w:t>
+            </w:r>
+          </w:p>
+        </w:tc>
+        <w:tc>
+          <w:tcPr>
+            <w:tcW w:type="dxa" w:w="567"/>
+          </w:tcPr>
+          <w:p>
+            <w:pPr>
+              <w:jc w:val="center"/>
+            </w:pPr>
+            <w:r/>
+            <w:r>
+              <w:rPr>
+                <w:rFonts w:ascii="Times New Roman" w:hAnsi="Times New Roman"/>
+                <w:sz w:val="17"/>
+              </w:rPr>
+              <w:t>2</w:t>
+            </w:r>
+          </w:p>
+        </w:tc>
+        <w:tc>
+          <w:tcPr>
+            <w:tcW w:type="dxa" w:w="2835"/>
+          </w:tcPr>
+          <w:p>
+            <w:pPr>
+              <w:jc w:val="center"/>
+            </w:pPr>
+            <w:r/>
+            <w:r>
+              <w:rPr>
+                <w:rFonts w:ascii="Times New Roman" w:hAnsi="Times New Roman"/>
+                <w:sz w:val="17"/>
+              </w:rPr>
+              <w:t>5 Lower-mid, 12 Upper-mid, 1 High</w:t>
+            </w:r>
+          </w:p>
+        </w:tc>
+        <w:tc>
+          <w:tcPr>
+            <w:tcW w:type="dxa" w:w="1134"/>
+          </w:tcPr>
+          <w:p>
+            <w:pPr>
+              <w:jc w:val="center"/>
+            </w:pPr>
+            <w:r/>
+            <w:r>
+              <w:rPr>
+                <w:rFonts w:ascii="Times New Roman" w:hAnsi="Times New Roman"/>
+                <w:sz w:val="17"/>
+              </w:rPr>
+              <w:t>97.19</w:t>
+            </w:r>
+          </w:p>
+        </w:tc>
+        <w:tc>
+          <w:tcPr>
+            <w:tcW w:type="dxa" w:w="1134"/>
+          </w:tcPr>
+          <w:p>
+            <w:pPr>
+              <w:jc w:val="left"/>
+            </w:pPr>
+            <w:r/>
+            <w:r>
+              <w:rPr>
+                <w:rFonts w:ascii="Times New Roman" w:hAnsi="Times New Roman"/>
+                <w:sz w:val="17"/>
+              </w:rPr>
+              <w:t>5.40</w:t>
+            </w:r>
+          </w:p>
+        </w:tc>
+      </w:tr>
+      <w:tr>
+        <w:tc>
+          <w:tcPr>
+            <w:tcW w:type="dxa" w:w="1701"/>
+          </w:tcPr>
+          <w:p>
+            <w:pPr>
+              <w:jc w:val="center"/>
+            </w:pPr>
+            <w:r/>
+            <w:r>
+              <w:rPr>
+                <w:rFonts w:ascii="Times New Roman" w:hAnsi="Times New Roman"/>
+                <w:sz w:val="17"/>
+              </w:rPr>
+              <w:t>Band 5 (1.0–10.0%)</w:t>
+            </w:r>
+          </w:p>
+        </w:tc>
+        <w:tc>
+          <w:tcPr>
+            <w:tcW w:type="dxa" w:w="850"/>
+          </w:tcPr>
+          <w:p>
+            <w:pPr>
+              <w:jc w:val="center"/>
+            </w:pPr>
+            <w:r/>
+            <w:r>
+              <w:rPr>
+                <w:rFonts w:ascii="Times New Roman" w:hAnsi="Times New Roman"/>
+                <w:sz w:val="17"/>
+              </w:rPr>
+              <w:t>3</w:t>
+            </w:r>
+          </w:p>
+        </w:tc>
+        <w:tc>
+          <w:tcPr>
+            <w:tcW w:type="dxa" w:w="567"/>
+          </w:tcPr>
+          <w:p>
+            <w:pPr>
+              <w:jc w:val="center"/>
+            </w:pPr>
+            <w:r/>
+            <w:r>
+              <w:rPr>
+                <w:rFonts w:ascii="Times New Roman" w:hAnsi="Times New Roman"/>
+                <w:sz w:val="17"/>
+              </w:rPr>
+              <w:t>0</w:t>
+            </w:r>
+          </w:p>
+        </w:tc>
+        <w:tc>
+          <w:tcPr>
+            <w:tcW w:type="dxa" w:w="567"/>
+          </w:tcPr>
+          <w:p>
+            <w:pPr>
+              <w:jc w:val="center"/>
+            </w:pPr>
+            <w:r/>
+            <w:r>
+              <w:rPr>
+                <w:rFonts w:ascii="Times New Roman" w:hAnsi="Times New Roman"/>
+                <w:sz w:val="17"/>
+              </w:rPr>
+              <w:t>0</w:t>
+            </w:r>
+          </w:p>
+        </w:tc>
+        <w:tc>
+          <w:tcPr>
+            <w:tcW w:type="dxa" w:w="2835"/>
+          </w:tcPr>
+          <w:p>
+            <w:pPr>
+              <w:jc w:val="center"/>
+            </w:pPr>
+            <w:r/>
+            <w:r>
+              <w:rPr>
+                <w:rFonts w:ascii="Times New Roman" w:hAnsi="Times New Roman"/>
+                <w:sz w:val="17"/>
+              </w:rPr>
+              <w:t>1 Lower-mid, 2 Upper-mid</w:t>
+            </w:r>
+          </w:p>
+        </w:tc>
+        <w:tc>
+          <w:tcPr>
+            <w:tcW w:type="dxa" w:w="1134"/>
+          </w:tcPr>
+          <w:p>
+            <w:pPr>
+              <w:jc w:val="center"/>
+            </w:pPr>
+            <w:r/>
+            <w:r>
+              <w:rPr>
+                <w:rFonts w:ascii="Times New Roman" w:hAnsi="Times New Roman"/>
+                <w:sz w:val="17"/>
+              </w:rPr>
+              <w:t>12.79</w:t>
+            </w:r>
+          </w:p>
+        </w:tc>
+        <w:tc>
+          <w:tcPr>
+            <w:tcW w:type="dxa" w:w="1134"/>
+          </w:tcPr>
+          <w:p>
+            <w:pPr>
+              <w:jc w:val="left"/>
+            </w:pPr>
+            <w:r/>
+            <w:r>
+              <w:rPr>
+                <w:rFonts w:ascii="Times New Roman" w:hAnsi="Times New Roman"/>
+                <w:sz w:val="17"/>
+              </w:rPr>
+              <w:t>4.26</w:t>
+            </w:r>
+          </w:p>
+        </w:tc>
+      </w:tr>
+      <w:tr>
+        <w:tc>
+          <w:tcPr>
+            <w:tcW w:type="dxa" w:w="1701"/>
+          </w:tcPr>
+          <w:p>
+            <w:pPr>
+              <w:jc w:val="center"/>
+            </w:pPr>
+            <w:r/>
+            <w:r>
+              <w:rPr>
+                <w:rFonts w:ascii="Times New Roman" w:hAnsi="Times New Roman"/>
+                <w:sz w:val="17"/>
+              </w:rPr>
+              <w:t>Band 6 (&gt;10.0%)</w:t>
+            </w:r>
+          </w:p>
+        </w:tc>
+        <w:tc>
+          <w:tcPr>
+            <w:tcW w:type="dxa" w:w="850"/>
+          </w:tcPr>
+          <w:p>
+            <w:pPr>
+              <w:jc w:val="center"/>
+            </w:pPr>
+            <w:r/>
+            <w:r>
+              <w:rPr>
+                <w:rFonts w:ascii="Times New Roman" w:hAnsi="Times New Roman"/>
+                <w:sz w:val="17"/>
+              </w:rPr>
+              <w:t>1</w:t>
+            </w:r>
+          </w:p>
+        </w:tc>
+        <w:tc>
+          <w:tcPr>
+            <w:tcW w:type="dxa" w:w="567"/>
+          </w:tcPr>
+          <w:p>
+            <w:pPr>
+              <w:jc w:val="center"/>
+            </w:pPr>
+            <w:r/>
+            <w:r>
+              <w:rPr>
+                <w:rFonts w:ascii="Times New Roman" w:hAnsi="Times New Roman"/>
+                <w:sz w:val="17"/>
+              </w:rPr>
+              <w:t>0</w:t>
+            </w:r>
+          </w:p>
+        </w:tc>
+        <w:tc>
+          <w:tcPr>
+            <w:tcW w:type="dxa" w:w="567"/>
+          </w:tcPr>
+          <w:p>
+            <w:pPr>
+              <w:jc w:val="center"/>
+            </w:pPr>
+            <w:r/>
+            <w:r>
+              <w:rPr>
+                <w:rFonts w:ascii="Times New Roman" w:hAnsi="Times New Roman"/>
+                <w:sz w:val="17"/>
+              </w:rPr>
+              <w:t>0</w:t>
+            </w:r>
+          </w:p>
+        </w:tc>
+        <w:tc>
+          <w:tcPr>
+            <w:tcW w:type="dxa" w:w="2835"/>
+          </w:tcPr>
+          <w:p>
+            <w:pPr>
+              <w:jc w:val="center"/>
+            </w:pPr>
+            <w:r/>
+            <w:r>
+              <w:rPr>
+                <w:rFonts w:ascii="Times New Roman" w:hAnsi="Times New Roman"/>
+                <w:sz w:val="17"/>
+              </w:rPr>
+              <w:t>1 Upper-mid</w:t>
+            </w:r>
+          </w:p>
+        </w:tc>
+        <w:tc>
+          <w:tcPr>
+            <w:tcW w:type="dxa" w:w="1134"/>
+          </w:tcPr>
+          <w:p>
+            <w:pPr>
+              <w:jc w:val="center"/>
+            </w:pPr>
+            <w:r/>
+            <w:r>
+              <w:rPr>
+                <w:rFonts w:ascii="Times New Roman" w:hAnsi="Times New Roman"/>
+                <w:sz w:val="17"/>
+              </w:rPr>
+              <w:t>2.27</w:t>
+            </w:r>
+          </w:p>
+        </w:tc>
+        <w:tc>
+          <w:tcPr>
+            <w:tcW w:type="dxa" w:w="1134"/>
+          </w:tcPr>
+          <w:p>
+            <w:pPr>
+              <w:jc w:val="left"/>
+            </w:pPr>
+            <w:r/>
+            <w:r>
+              <w:rPr>
+                <w:rFonts w:ascii="Times New Roman" w:hAnsi="Times New Roman"/>
+                <w:sz w:val="17"/>
+              </w:rPr>
+              <w:t>2.27</w:t>
+            </w:r>
+          </w:p>
+        </w:tc>
+      </w:tr>
+    </w:tbl>
+    <w:p>
+      <w:pPr>
+        <w:jc w:val="center"/>
+      </w:pPr>
+      <w:r>
+        <w:rPr>
+          <w:rFonts w:ascii="Times New Roman" w:hAnsi="Times New Roman"/>
+          <w:i/>
+          <w:sz w:val="17"/>
+        </w:rPr>
+        <w:t>Table D1. IUSAF band composition (142 eligible Parties, high-income excluded)</w:t>
+      </w:r>
+    </w:p>
+    <w:p/>
+    <w:p>
+      <w:pPr>
+        <w:spacing w:after="120"/>
+      </w:pPr>
+      <w:r>
+        <w:t>Table D2 shows how total band allocations change relative to the pure IUSAF baseline as TSAC increases. Positive values indicate the band gains funds; negative values indicate the band loses funds.</w:t>
+      </w:r>
+    </w:p>
+    <w:tbl>
+      <w:tblPr>
+        <w:tblStyle w:val="TableGrid"/>
+        <w:tblW w:type="auto" w:w="0"/>
+        <w:jc w:val="center"/>
+        <w:tblLook w:firstColumn="1" w:firstRow="1" w:lastColumn="0" w:lastRow="0" w:noHBand="0" w:noVBand="1" w:val="04A0"/>
+      </w:tblPr>
+      <w:tblGrid>
+        <w:gridCol w:w="1344"/>
+        <w:gridCol w:w="1344"/>
+        <w:gridCol w:w="1344"/>
+        <w:gridCol w:w="1344"/>
+        <w:gridCol w:w="1344"/>
+        <w:gridCol w:w="1344"/>
+        <w:gridCol w:w="1344"/>
+      </w:tblGrid>
+      <w:tr>
+        <w:tc>
+          <w:tcPr>
+            <w:tcW w:type="dxa" w:w="1417"/>
+            <w:shd w:fill="D9D9D9"/>
+          </w:tcPr>
+          <w:p>
+            <w:pPr>
+              <w:jc w:val="center"/>
+            </w:pPr>
+            <w:r/>
+            <w:r>
+              <w:rPr>
+                <w:rFonts w:ascii="Times New Roman" w:hAnsi="Times New Roman"/>
+                <w:b/>
+                <w:sz w:val="17"/>
+              </w:rPr>
+              <w:t>Band</w:t>
+            </w:r>
+          </w:p>
+        </w:tc>
+        <w:tc>
+          <w:tcPr>
+            <w:tcW w:type="dxa" w:w="850"/>
+            <w:shd w:fill="D9D9D9"/>
+          </w:tcPr>
+          <w:p>
+            <w:pPr>
+              <w:jc w:val="center"/>
+            </w:pPr>
+            <w:r/>
+            <w:r>
+              <w:rPr>
+                <w:rFonts w:ascii="Times New Roman" w:hAnsi="Times New Roman"/>
+                <w:b/>
+                <w:sz w:val="17"/>
+              </w:rPr>
+              <w:t>Parties</w:t>
+            </w:r>
+          </w:p>
+        </w:tc>
+        <w:tc>
+          <w:tcPr>
+            <w:tcW w:type="dxa" w:w="1417"/>
+            <w:shd w:fill="D9D9D9"/>
+          </w:tcPr>
+          <w:p>
+            <w:pPr>
+              <w:jc w:val="center"/>
+            </w:pPr>
+            <w:r/>
+            <w:r>
+              <w:rPr>
+                <w:rFonts w:ascii="Times New Roman" w:hAnsi="Times New Roman"/>
+                <w:b/>
+                <w:sz w:val="17"/>
+              </w:rPr>
+              <w:t>Δ at 1.5%</w:t>
+            </w:r>
+            <w:r>
+              <w:br/>
+            </w:r>
+            <w:r>
+              <w:rPr>
+                <w:rFonts w:ascii="Times New Roman" w:hAnsi="Times New Roman"/>
+                <w:b/>
+                <w:sz w:val="17"/>
+              </w:rPr>
+              <w:t>(USD M)</w:t>
+            </w:r>
+          </w:p>
+        </w:tc>
+        <w:tc>
+          <w:tcPr>
+            <w:tcW w:type="dxa" w:w="1417"/>
+            <w:shd w:fill="D9D9D9"/>
+          </w:tcPr>
+          <w:p>
+            <w:pPr>
+              <w:jc w:val="center"/>
+            </w:pPr>
+            <w:r/>
+            <w:r>
+              <w:rPr>
+                <w:rFonts w:ascii="Times New Roman" w:hAnsi="Times New Roman"/>
+                <w:b/>
+                <w:sz w:val="17"/>
+              </w:rPr>
+              <w:t>Δ at 2.5%</w:t>
+            </w:r>
+            <w:r>
+              <w:br/>
+            </w:r>
+            <w:r>
+              <w:rPr>
+                <w:rFonts w:ascii="Times New Roman" w:hAnsi="Times New Roman"/>
+                <w:b/>
+                <w:sz w:val="17"/>
+              </w:rPr>
+              <w:t>(USD M)</w:t>
+            </w:r>
+          </w:p>
+        </w:tc>
+        <w:tc>
+          <w:tcPr>
+            <w:tcW w:type="dxa" w:w="1417"/>
+            <w:shd w:fill="D9D9D9"/>
+          </w:tcPr>
+          <w:p>
+            <w:pPr>
+              <w:jc w:val="center"/>
+            </w:pPr>
+            <w:r/>
+            <w:r>
+              <w:rPr>
+                <w:rFonts w:ascii="Times New Roman" w:hAnsi="Times New Roman"/>
+                <w:b/>
+                <w:sz w:val="17"/>
+              </w:rPr>
+              <w:t>Δ at 3.0%</w:t>
+            </w:r>
+            <w:r>
+              <w:br/>
+            </w:r>
+            <w:r>
+              <w:rPr>
+                <w:rFonts w:ascii="Times New Roman" w:hAnsi="Times New Roman"/>
+                <w:b/>
+                <w:sz w:val="17"/>
+              </w:rPr>
+              <w:t>(USD M)</w:t>
+            </w:r>
+          </w:p>
+        </w:tc>
+        <w:tc>
+          <w:tcPr>
+            <w:tcW w:type="dxa" w:w="1417"/>
+            <w:shd w:fill="D9D9D9"/>
+          </w:tcPr>
+          <w:p>
+            <w:pPr>
+              <w:jc w:val="center"/>
+            </w:pPr>
+            <w:r/>
+            <w:r>
+              <w:rPr>
+                <w:rFonts w:ascii="Times New Roman" w:hAnsi="Times New Roman"/>
+                <w:b/>
+                <w:sz w:val="17"/>
+              </w:rPr>
+              <w:t>Δ at 3.5%</w:t>
+            </w:r>
+            <w:r>
+              <w:br/>
+            </w:r>
+            <w:r>
+              <w:rPr>
+                <w:rFonts w:ascii="Times New Roman" w:hAnsi="Times New Roman"/>
+                <w:b/>
+                <w:sz w:val="17"/>
+              </w:rPr>
+              <w:t>(USD M)</w:t>
+            </w:r>
+          </w:p>
+        </w:tc>
+        <w:tc>
+          <w:tcPr>
+            <w:tcW w:type="dxa" w:w="1417"/>
+            <w:shd w:fill="D9D9D9"/>
+          </w:tcPr>
+          <w:p>
+            <w:pPr>
+              <w:jc w:val="center"/>
+            </w:pPr>
+            <w:r/>
+            <w:r>
+              <w:rPr>
+                <w:rFonts w:ascii="Times New Roman" w:hAnsi="Times New Roman"/>
+                <w:b/>
+                <w:sz w:val="17"/>
+              </w:rPr>
+              <w:t>Δ at 5.0%</w:t>
+            </w:r>
+            <w:r>
+              <w:br/>
+            </w:r>
+            <w:r>
+              <w:rPr>
+                <w:rFonts w:ascii="Times New Roman" w:hAnsi="Times New Roman"/>
+                <w:b/>
+                <w:sz w:val="17"/>
+              </w:rPr>
+              <w:t>(USD M)</w:t>
+            </w:r>
+          </w:p>
+        </w:tc>
+      </w:tr>
+      <w:tr>
+        <w:tc>
+          <w:tcPr>
+            <w:tcW w:type="dxa" w:w="1417"/>
+          </w:tcPr>
+          <w:p>
+            <w:pPr>
+              <w:jc w:val="center"/>
+            </w:pPr>
+            <w:r/>
+            <w:r>
+              <w:rPr>
+                <w:rFonts w:ascii="Times New Roman" w:hAnsi="Times New Roman"/>
+                <w:sz w:val="17"/>
+              </w:rPr>
+              <w:t>Band 1</w:t>
+            </w:r>
+          </w:p>
+        </w:tc>
+        <w:tc>
+          <w:tcPr>
+            <w:tcW w:type="dxa" w:w="850"/>
+          </w:tcPr>
+          <w:p>
+            <w:pPr>
+              <w:jc w:val="center"/>
+            </w:pPr>
+            <w:r/>
+            <w:r>
+              <w:rPr>
+                <w:rFonts w:ascii="Times New Roman" w:hAnsi="Times New Roman"/>
+                <w:sz w:val="17"/>
+              </w:rPr>
+              <w:t>31</w:t>
+            </w:r>
+          </w:p>
+        </w:tc>
+        <w:tc>
+          <w:tcPr>
+            <w:tcW w:type="dxa" w:w="1417"/>
+          </w:tcPr>
+          <w:p>
+            <w:pPr>
+              <w:jc w:val="center"/>
+            </w:pPr>
+            <w:r/>
+            <w:r>
+              <w:rPr>
+                <w:rFonts w:ascii="Times New Roman" w:hAnsi="Times New Roman"/>
+                <w:sz w:val="17"/>
+              </w:rPr>
+              <w:t>+5.25</w:t>
+            </w:r>
+          </w:p>
+        </w:tc>
+        <w:tc>
+          <w:tcPr>
+            <w:tcW w:type="dxa" w:w="1417"/>
+          </w:tcPr>
+          <w:p>
+            <w:pPr>
+              <w:jc w:val="center"/>
+            </w:pPr>
+            <w:r/>
+            <w:r>
+              <w:rPr>
+                <w:rFonts w:ascii="Times New Roman" w:hAnsi="Times New Roman"/>
+                <w:sz w:val="17"/>
+              </w:rPr>
+              <w:t>+2.75</w:t>
+            </w:r>
+          </w:p>
+        </w:tc>
+        <w:tc>
+          <w:tcPr>
+            <w:tcW w:type="dxa" w:w="1417"/>
+          </w:tcPr>
+          <w:p>
+            <w:pPr>
+              <w:jc w:val="center"/>
+            </w:pPr>
+            <w:r/>
+            <w:r>
+              <w:rPr>
+                <w:rFonts w:ascii="Times New Roman" w:hAnsi="Times New Roman"/>
+                <w:sz w:val="17"/>
+              </w:rPr>
+              <w:t>+1.50</w:t>
+            </w:r>
+          </w:p>
+        </w:tc>
+        <w:tc>
+          <w:tcPr>
+            <w:tcW w:type="dxa" w:w="1417"/>
+          </w:tcPr>
+          <w:p>
+            <w:pPr>
+              <w:jc w:val="center"/>
+            </w:pPr>
+            <w:r/>
+            <w:r>
+              <w:rPr>
+                <w:rFonts w:ascii="Times New Roman" w:hAnsi="Times New Roman"/>
+                <w:sz w:val="17"/>
+              </w:rPr>
+              <w:t>+0.26</w:t>
+            </w:r>
+          </w:p>
+        </w:tc>
+        <w:tc>
+          <w:tcPr>
+            <w:tcW w:type="dxa" w:w="1417"/>
+          </w:tcPr>
+          <w:p>
+            <w:pPr>
+              <w:jc w:val="left"/>
+            </w:pPr>
+            <w:r/>
+            <w:r>
+              <w:rPr>
+                <w:rFonts w:ascii="Times New Roman" w:hAnsi="Times New Roman"/>
+                <w:sz w:val="17"/>
+              </w:rPr>
+              <w:t>-3.49</w:t>
+            </w:r>
+          </w:p>
+        </w:tc>
+      </w:tr>
+      <w:tr>
+        <w:tc>
+          <w:tcPr>
+            <w:tcW w:type="dxa" w:w="1417"/>
+          </w:tcPr>
+          <w:p>
+            <w:pPr>
+              <w:jc w:val="center"/>
+            </w:pPr>
+            <w:r/>
+            <w:r>
+              <w:rPr>
+                <w:rFonts w:ascii="Times New Roman" w:hAnsi="Times New Roman"/>
+                <w:b/>
+                <w:color w:val="CC0000"/>
+                <w:sz w:val="17"/>
+              </w:rPr>
+              <w:t>Band 2</w:t>
+            </w:r>
+          </w:p>
+        </w:tc>
+        <w:tc>
+          <w:tcPr>
+            <w:tcW w:type="dxa" w:w="850"/>
+          </w:tcPr>
+          <w:p>
+            <w:pPr>
+              <w:jc w:val="center"/>
+            </w:pPr>
+            <w:r/>
+            <w:r>
+              <w:rPr>
+                <w:rFonts w:ascii="Times New Roman" w:hAnsi="Times New Roman"/>
+                <w:b/>
+                <w:color w:val="CC0000"/>
+                <w:sz w:val="17"/>
+              </w:rPr>
+              <w:t>59</w:t>
+            </w:r>
+          </w:p>
+        </w:tc>
+        <w:tc>
+          <w:tcPr>
+            <w:tcW w:type="dxa" w:w="1417"/>
+          </w:tcPr>
+          <w:p>
+            <w:pPr>
+              <w:jc w:val="center"/>
+            </w:pPr>
+            <w:r/>
+            <w:r>
+              <w:rPr>
+                <w:rFonts w:ascii="Times New Roman" w:hAnsi="Times New Roman"/>
+                <w:b/>
+                <w:color w:val="CC0000"/>
+                <w:sz w:val="17"/>
+              </w:rPr>
+              <w:t>-6.52</w:t>
+            </w:r>
+          </w:p>
+        </w:tc>
+        <w:tc>
+          <w:tcPr>
+            <w:tcW w:type="dxa" w:w="1417"/>
+          </w:tcPr>
+          <w:p>
+            <w:pPr>
+              <w:jc w:val="center"/>
+            </w:pPr>
+            <w:r/>
+            <w:r>
+              <w:rPr>
+                <w:rFonts w:ascii="Times New Roman" w:hAnsi="Times New Roman"/>
+                <w:b/>
+                <w:color w:val="CC0000"/>
+                <w:sz w:val="17"/>
+              </w:rPr>
+              <w:t>-7.79</w:t>
+            </w:r>
+          </w:p>
+        </w:tc>
+        <w:tc>
+          <w:tcPr>
+            <w:tcW w:type="dxa" w:w="1417"/>
+          </w:tcPr>
+          <w:p>
+            <w:pPr>
+              <w:jc w:val="center"/>
+            </w:pPr>
+            <w:r/>
+            <w:r>
+              <w:rPr>
+                <w:rFonts w:ascii="Times New Roman" w:hAnsi="Times New Roman"/>
+                <w:b/>
+                <w:color w:val="CC0000"/>
+                <w:sz w:val="17"/>
+              </w:rPr>
+              <w:t>-8.42</w:t>
+            </w:r>
+          </w:p>
+        </w:tc>
+        <w:tc>
+          <w:tcPr>
+            <w:tcW w:type="dxa" w:w="1417"/>
+          </w:tcPr>
+          <w:p>
+            <w:pPr>
+              <w:jc w:val="center"/>
+            </w:pPr>
+            <w:r/>
+            <w:r>
+              <w:rPr>
+                <w:rFonts w:ascii="Times New Roman" w:hAnsi="Times New Roman"/>
+                <w:b/>
+                <w:color w:val="CC0000"/>
+                <w:sz w:val="17"/>
+              </w:rPr>
+              <w:t>-9.06</w:t>
+            </w:r>
+          </w:p>
+        </w:tc>
+        <w:tc>
+          <w:tcPr>
+            <w:tcW w:type="dxa" w:w="1417"/>
+          </w:tcPr>
+          <w:p>
+            <w:pPr>
+              <w:jc w:val="left"/>
+            </w:pPr>
+            <w:r/>
+            <w:r>
+              <w:rPr>
+                <w:rFonts w:ascii="Times New Roman" w:hAnsi="Times New Roman"/>
+                <w:b/>
+                <w:color w:val="CC0000"/>
+                <w:sz w:val="17"/>
+              </w:rPr>
+              <w:t>-10.96</w:t>
+            </w:r>
+          </w:p>
+        </w:tc>
+      </w:tr>
+      <w:tr>
+        <w:tc>
+          <w:tcPr>
+            <w:tcW w:type="dxa" w:w="1417"/>
+          </w:tcPr>
+          <w:p>
+            <w:pPr>
+              <w:jc w:val="center"/>
+            </w:pPr>
+            <w:r/>
+            <w:r>
+              <w:rPr>
+                <w:rFonts w:ascii="Times New Roman" w:hAnsi="Times New Roman"/>
+                <w:sz w:val="17"/>
+              </w:rPr>
+              <w:t>Band 3</w:t>
+            </w:r>
+          </w:p>
+        </w:tc>
+        <w:tc>
+          <w:tcPr>
+            <w:tcW w:type="dxa" w:w="850"/>
+          </w:tcPr>
+          <w:p>
+            <w:pPr>
+              <w:jc w:val="center"/>
+            </w:pPr>
+            <w:r/>
+            <w:r>
+              <w:rPr>
+                <w:rFonts w:ascii="Times New Roman" w:hAnsi="Times New Roman"/>
+                <w:sz w:val="17"/>
+              </w:rPr>
+              <w:t>30</w:t>
+            </w:r>
+          </w:p>
+        </w:tc>
+        <w:tc>
+          <w:tcPr>
+            <w:tcW w:type="dxa" w:w="1417"/>
+          </w:tcPr>
+          <w:p>
+            <w:pPr>
+              <w:jc w:val="center"/>
+            </w:pPr>
+            <w:r/>
+            <w:r>
+              <w:rPr>
+                <w:rFonts w:ascii="Times New Roman" w:hAnsi="Times New Roman"/>
+                <w:sz w:val="17"/>
+              </w:rPr>
+              <w:t>-3.01</w:t>
+            </w:r>
+          </w:p>
+        </w:tc>
+        <w:tc>
+          <w:tcPr>
+            <w:tcW w:type="dxa" w:w="1417"/>
+          </w:tcPr>
+          <w:p>
+            <w:pPr>
+              <w:jc w:val="center"/>
+            </w:pPr>
+            <w:r/>
+            <w:r>
+              <w:rPr>
+                <w:rFonts w:ascii="Times New Roman" w:hAnsi="Times New Roman"/>
+                <w:sz w:val="17"/>
+              </w:rPr>
+              <w:t>-3.32</w:t>
+            </w:r>
+          </w:p>
+        </w:tc>
+        <w:tc>
+          <w:tcPr>
+            <w:tcW w:type="dxa" w:w="1417"/>
+          </w:tcPr>
+          <w:p>
+            <w:pPr>
+              <w:jc w:val="center"/>
+            </w:pPr>
+            <w:r/>
+            <w:r>
+              <w:rPr>
+                <w:rFonts w:ascii="Times New Roman" w:hAnsi="Times New Roman"/>
+                <w:sz w:val="17"/>
+              </w:rPr>
+              <w:t>-3.48</w:t>
+            </w:r>
+          </w:p>
+        </w:tc>
+        <w:tc>
+          <w:tcPr>
+            <w:tcW w:type="dxa" w:w="1417"/>
+          </w:tcPr>
+          <w:p>
+            <w:pPr>
+              <w:jc w:val="center"/>
+            </w:pPr>
+            <w:r/>
+            <w:r>
+              <w:rPr>
+                <w:rFonts w:ascii="Times New Roman" w:hAnsi="Times New Roman"/>
+                <w:sz w:val="17"/>
+              </w:rPr>
+              <w:t>-3.63</w:t>
+            </w:r>
+          </w:p>
+        </w:tc>
+        <w:tc>
+          <w:tcPr>
+            <w:tcW w:type="dxa" w:w="1417"/>
+          </w:tcPr>
+          <w:p>
+            <w:pPr>
+              <w:jc w:val="left"/>
+            </w:pPr>
+            <w:r/>
+            <w:r>
+              <w:rPr>
+                <w:rFonts w:ascii="Times New Roman" w:hAnsi="Times New Roman"/>
+                <w:sz w:val="17"/>
+              </w:rPr>
+              <w:t>-4.10</w:t>
+            </w:r>
+          </w:p>
+        </w:tc>
+      </w:tr>
+      <w:tr>
+        <w:tc>
+          <w:tcPr>
+            <w:tcW w:type="dxa" w:w="1417"/>
+          </w:tcPr>
+          <w:p>
+            <w:pPr>
+              <w:jc w:val="center"/>
+            </w:pPr>
+            <w:r/>
+            <w:r>
+              <w:rPr>
+                <w:rFonts w:ascii="Times New Roman" w:hAnsi="Times New Roman"/>
+                <w:sz w:val="17"/>
+              </w:rPr>
+              <w:t>Band 4</w:t>
+            </w:r>
+          </w:p>
+        </w:tc>
+        <w:tc>
+          <w:tcPr>
+            <w:tcW w:type="dxa" w:w="850"/>
+          </w:tcPr>
+          <w:p>
+            <w:pPr>
+              <w:jc w:val="center"/>
+            </w:pPr>
+            <w:r/>
+            <w:r>
+              <w:rPr>
+                <w:rFonts w:ascii="Times New Roman" w:hAnsi="Times New Roman"/>
+                <w:sz w:val="17"/>
+              </w:rPr>
+              <w:t>18</w:t>
+            </w:r>
+          </w:p>
+        </w:tc>
+        <w:tc>
+          <w:tcPr>
+            <w:tcW w:type="dxa" w:w="1417"/>
+          </w:tcPr>
+          <w:p>
+            <w:pPr>
+              <w:jc w:val="center"/>
+            </w:pPr>
+            <w:r/>
+            <w:r>
+              <w:rPr>
+                <w:rFonts w:ascii="Times New Roman" w:hAnsi="Times New Roman"/>
+                <w:sz w:val="17"/>
+              </w:rPr>
+              <w:t>+0.62</w:t>
+            </w:r>
+          </w:p>
+        </w:tc>
+        <w:tc>
+          <w:tcPr>
+            <w:tcW w:type="dxa" w:w="1417"/>
+          </w:tcPr>
+          <w:p>
+            <w:pPr>
+              <w:jc w:val="center"/>
+            </w:pPr>
+            <w:r/>
+            <w:r>
+              <w:rPr>
+                <w:rFonts w:ascii="Times New Roman" w:hAnsi="Times New Roman"/>
+                <w:sz w:val="17"/>
+              </w:rPr>
+              <w:t>+1.94</w:t>
+            </w:r>
+          </w:p>
+        </w:tc>
+        <w:tc>
+          <w:tcPr>
+            <w:tcW w:type="dxa" w:w="1417"/>
+          </w:tcPr>
+          <w:p>
+            <w:pPr>
+              <w:jc w:val="center"/>
+            </w:pPr>
+            <w:r/>
+            <w:r>
+              <w:rPr>
+                <w:rFonts w:ascii="Times New Roman" w:hAnsi="Times New Roman"/>
+                <w:sz w:val="17"/>
+              </w:rPr>
+              <w:t>+2.61</w:t>
+            </w:r>
+          </w:p>
+        </w:tc>
+        <w:tc>
+          <w:tcPr>
+            <w:tcW w:type="dxa" w:w="1417"/>
+          </w:tcPr>
+          <w:p>
+            <w:pPr>
+              <w:jc w:val="center"/>
+            </w:pPr>
+            <w:r/>
+            <w:r>
+              <w:rPr>
+                <w:rFonts w:ascii="Times New Roman" w:hAnsi="Times New Roman"/>
+                <w:sz w:val="17"/>
+              </w:rPr>
+              <w:t>+3.27</w:t>
+            </w:r>
+          </w:p>
+        </w:tc>
+        <w:tc>
+          <w:tcPr>
+            <w:tcW w:type="dxa" w:w="1417"/>
+          </w:tcPr>
+          <w:p>
+            <w:pPr>
+              <w:jc w:val="left"/>
+            </w:pPr>
+            <w:r/>
+            <w:r>
+              <w:rPr>
+                <w:rFonts w:ascii="Times New Roman" w:hAnsi="Times New Roman"/>
+                <w:sz w:val="17"/>
+              </w:rPr>
+              <w:t>+5.26</w:t>
+            </w:r>
+          </w:p>
+        </w:tc>
+      </w:tr>
+      <w:tr>
+        <w:tc>
+          <w:tcPr>
+            <w:tcW w:type="dxa" w:w="1417"/>
+          </w:tcPr>
+          <w:p>
+            <w:pPr>
+              <w:jc w:val="center"/>
+            </w:pPr>
+            <w:r/>
+            <w:r>
+              <w:rPr>
+                <w:rFonts w:ascii="Times New Roman" w:hAnsi="Times New Roman"/>
+                <w:sz w:val="17"/>
+              </w:rPr>
+              <w:t>Band 5</w:t>
+            </w:r>
+          </w:p>
+        </w:tc>
+        <w:tc>
+          <w:tcPr>
+            <w:tcW w:type="dxa" w:w="850"/>
+          </w:tcPr>
+          <w:p>
+            <w:pPr>
+              <w:jc w:val="center"/>
+            </w:pPr>
+            <w:r/>
+            <w:r>
+              <w:rPr>
+                <w:rFonts w:ascii="Times New Roman" w:hAnsi="Times New Roman"/>
+                <w:sz w:val="17"/>
+              </w:rPr>
+              <w:t>3</w:t>
+            </w:r>
+          </w:p>
+        </w:tc>
+        <w:tc>
+          <w:tcPr>
+            <w:tcW w:type="dxa" w:w="1417"/>
+          </w:tcPr>
+          <w:p>
+            <w:pPr>
+              <w:jc w:val="center"/>
+            </w:pPr>
+            <w:r/>
+            <w:r>
+              <w:rPr>
+                <w:rFonts w:ascii="Times New Roman" w:hAnsi="Times New Roman"/>
+                <w:sz w:val="17"/>
+              </w:rPr>
+              <w:t>+1.97</w:t>
+            </w:r>
+          </w:p>
+        </w:tc>
+        <w:tc>
+          <w:tcPr>
+            <w:tcW w:type="dxa" w:w="1417"/>
+          </w:tcPr>
+          <w:p>
+            <w:pPr>
+              <w:jc w:val="center"/>
+            </w:pPr>
+            <w:r/>
+            <w:r>
+              <w:rPr>
+                <w:rFonts w:ascii="Times New Roman" w:hAnsi="Times New Roman"/>
+                <w:sz w:val="17"/>
+              </w:rPr>
+              <w:t>+3.54</w:t>
+            </w:r>
+          </w:p>
+        </w:tc>
+        <w:tc>
+          <w:tcPr>
+            <w:tcW w:type="dxa" w:w="1417"/>
+          </w:tcPr>
+          <w:p>
+            <w:pPr>
+              <w:jc w:val="center"/>
+            </w:pPr>
+            <w:r/>
+            <w:r>
+              <w:rPr>
+                <w:rFonts w:ascii="Times New Roman" w:hAnsi="Times New Roman"/>
+                <w:sz w:val="17"/>
+              </w:rPr>
+              <w:t>+4.32</w:t>
+            </w:r>
+          </w:p>
+        </w:tc>
+        <w:tc>
+          <w:tcPr>
+            <w:tcW w:type="dxa" w:w="1417"/>
+          </w:tcPr>
+          <w:p>
+            <w:pPr>
+              <w:jc w:val="center"/>
+            </w:pPr>
+            <w:r/>
+            <w:r>
+              <w:rPr>
+                <w:rFonts w:ascii="Times New Roman" w:hAnsi="Times New Roman"/>
+                <w:sz w:val="17"/>
+              </w:rPr>
+              <w:t>+5.11</w:t>
+            </w:r>
+          </w:p>
+        </w:tc>
+        <w:tc>
+          <w:tcPr>
+            <w:tcW w:type="dxa" w:w="1417"/>
+          </w:tcPr>
+          <w:p>
+            <w:pPr>
+              <w:jc w:val="left"/>
+            </w:pPr>
+            <w:r/>
+            <w:r>
+              <w:rPr>
+                <w:rFonts w:ascii="Times New Roman" w:hAnsi="Times New Roman"/>
+                <w:sz w:val="17"/>
+              </w:rPr>
+              <w:t>+7.46</w:t>
+            </w:r>
+          </w:p>
+        </w:tc>
+      </w:tr>
+      <w:tr>
+        <w:tc>
+          <w:tcPr>
+            <w:tcW w:type="dxa" w:w="1417"/>
+          </w:tcPr>
+          <w:p>
+            <w:pPr>
+              <w:jc w:val="center"/>
+            </w:pPr>
+            <w:r/>
+            <w:r>
+              <w:rPr>
+                <w:rFonts w:ascii="Times New Roman" w:hAnsi="Times New Roman"/>
+                <w:sz w:val="17"/>
+              </w:rPr>
+              <w:t>Band 6</w:t>
+            </w:r>
+          </w:p>
+        </w:tc>
+        <w:tc>
+          <w:tcPr>
+            <w:tcW w:type="dxa" w:w="850"/>
+          </w:tcPr>
+          <w:p>
+            <w:pPr>
+              <w:jc w:val="center"/>
+            </w:pPr>
+            <w:r/>
+            <w:r>
+              <w:rPr>
+                <w:rFonts w:ascii="Times New Roman" w:hAnsi="Times New Roman"/>
+                <w:sz w:val="17"/>
+              </w:rPr>
+              <w:t>1</w:t>
+            </w:r>
+          </w:p>
+        </w:tc>
+        <w:tc>
+          <w:tcPr>
+            <w:tcW w:type="dxa" w:w="1417"/>
+          </w:tcPr>
+          <w:p>
+            <w:pPr>
+              <w:jc w:val="center"/>
+            </w:pPr>
+            <w:r/>
+            <w:r>
+              <w:rPr>
+                <w:rFonts w:ascii="Times New Roman" w:hAnsi="Times New Roman"/>
+                <w:sz w:val="17"/>
+              </w:rPr>
+              <w:t>+1.70</w:t>
+            </w:r>
+          </w:p>
+        </w:tc>
+        <w:tc>
+          <w:tcPr>
+            <w:tcW w:type="dxa" w:w="1417"/>
+          </w:tcPr>
+          <w:p>
+            <w:pPr>
+              <w:jc w:val="center"/>
+            </w:pPr>
+            <w:r/>
+            <w:r>
+              <w:rPr>
+                <w:rFonts w:ascii="Times New Roman" w:hAnsi="Times New Roman"/>
+                <w:sz w:val="17"/>
+              </w:rPr>
+              <w:t>+2.88</w:t>
+            </w:r>
+          </w:p>
+        </w:tc>
+        <w:tc>
+          <w:tcPr>
+            <w:tcW w:type="dxa" w:w="1417"/>
+          </w:tcPr>
+          <w:p>
+            <w:pPr>
+              <w:jc w:val="center"/>
+            </w:pPr>
+            <w:r/>
+            <w:r>
+              <w:rPr>
+                <w:rFonts w:ascii="Times New Roman" w:hAnsi="Times New Roman"/>
+                <w:sz w:val="17"/>
+              </w:rPr>
+              <w:t>+3.46</w:t>
+            </w:r>
+          </w:p>
+        </w:tc>
+        <w:tc>
+          <w:tcPr>
+            <w:tcW w:type="dxa" w:w="1417"/>
+          </w:tcPr>
+          <w:p>
+            <w:pPr>
+              <w:jc w:val="center"/>
+            </w:pPr>
+            <w:r/>
+            <w:r>
+              <w:rPr>
+                <w:rFonts w:ascii="Times New Roman" w:hAnsi="Times New Roman"/>
+                <w:sz w:val="17"/>
+              </w:rPr>
+              <w:t>+4.05</w:t>
+            </w:r>
+          </w:p>
+        </w:tc>
+        <w:tc>
+          <w:tcPr>
+            <w:tcW w:type="dxa" w:w="1417"/>
+          </w:tcPr>
+          <w:p>
+            <w:pPr>
+              <w:jc w:val="left"/>
+            </w:pPr>
+            <w:r/>
+            <w:r>
+              <w:rPr>
+                <w:rFonts w:ascii="Times New Roman" w:hAnsi="Times New Roman"/>
+                <w:sz w:val="17"/>
+              </w:rPr>
+              <w:t>+5.82</w:t>
+            </w:r>
+          </w:p>
+        </w:tc>
+      </w:tr>
+    </w:tbl>
+    <w:p>
+      <w:pPr>
+        <w:jc w:val="center"/>
+      </w:pPr>
+      <w:r>
+        <w:rPr>
+          <w:rFonts w:ascii="Times New Roman" w:hAnsi="Times New Roman"/>
+          <w:i/>
+          <w:sz w:val="17"/>
+        </w:rPr>
+        <w:t>Table D2. Change in total band allocation vs pure IUSAF (USD M, SOSAC = 3%)</w:t>
+      </w:r>
+    </w:p>
+    <w:p>
+      <w:pPr>
+        <w:spacing w:after="120"/>
+      </w:pPr>
+      <w:r>
+        <w:t>The transfer analysis reveals a striking pattern: Band 2, containing 59 eligible Parties (including 31 LDCs and 11 SIDS), consistently bears the largest absolute loss at every TSAC level, while Band 6 (a single upper-middle-income Party, China) receives the largest absolute gain. At the Gini-minimum (TSAC = 2.5%), Band 2 loses $7.79M while Band 6 gains $2.88M — a 126.5% increase for Band 6 funded by a 1.8% reduction for Band 2. At TSAC = 3.5% (the former 'Bounded' point), Band 2 loses $9.06M while Band 6 gains $4.05M — a 178.3% increase.</w:t>
+      </w:r>
+    </w:p>
+    <w:p>
+      <w:pPr>
+        <w:spacing w:after="240"/>
+      </w:pPr>
+      <w:r>
+        <w:t>This raises an important political consideration: TSAC reallocates funds from the largest group of developing countries (Band 2, predominantly low and lower-middle income) towards the Party with the largest land area (Band 6, an upper-middle-income country). Beyond the band-order boundary at TSAC = 3.0%, this transfer also subverts the IUSAF ranking, giving China (Band 6) a higher per-Party allocation than Brazil, India and Mexico (Band 5). The Gini-minimum (TSAC = 2.5%) represents the point at which the equality gains from this transfer are maximised while the band ordering that protects Band 5 is still preserved.</w:t>
       </w:r>
     </w:p>
     <w:p>

</xml_diff>

<commit_message>
Add stewardship pool tables (E1, E2) by balance point and fund size
Table E1: IUSAF|TSAC|SOSAC breakdown at 6 fund sizes (0m–0bn)
Table E2: Total stewardship pool at each balance point and fund size
Confirms 93.5–95.5% IUSAF stability, 4.5–6.5% pool across all sizes.

Co-authored-by: factory-droid[bot] <138933559+factory-droid[bot]@users.noreply.github.com>
</commit_message>
<xml_diff>
--- a/model-tables/iusaf-tsac-section-draft.docx
+++ b/model-tables/iusaf-tsac-section-draft.docx
@@ -153,10 +153,1645 @@
     </w:p>
     <w:p>
       <w:pPr>
+        <w:spacing w:after="120"/>
+      </w:pPr>
+      <w:r>
+        <w:t>In considering these balance points it is important to calculate the volume of funds that are being allocated for IUSAF and TSAC and SOSAC. Under a US$1 billion fund 93.5–95.5% ($935–955m) will be stably allocated under the IUSAF. The amount under consideration for allocation under the three balance point scenarios is 4.5–6.5% of the Cali Fund or $45–65 million. Under these scenarios for 142 developing country Parties the vast majority would see reallocations of less than $0.5 million. As such, if IUSAF is accepted as the stable baseline, the question for consideration by Parties would be how to allocate the $45–65 million stewardship pool. Note that the size of the stewardship pool will scale in accordance with the overall size of the Cali Fund.</w:t>
+      </w:r>
+    </w:p>
+    <w:p>
+      <w:pPr>
+        <w:spacing w:after="120"/>
+      </w:pPr>
+      <w:r>
+        <w:t>Table E1 shows how the stewardship pool and its IUSAF, TSAC, and SOSAC components break down under each balance point at different projected fund sizes.</w:t>
+      </w:r>
+    </w:p>
+    <w:tbl>
+      <w:tblPr>
+        <w:tblStyle w:val="TableGrid"/>
+        <w:tblW w:type="auto" w:w="0"/>
+        <w:jc w:val="center"/>
+        <w:tblLook w:firstColumn="1" w:firstRow="1" w:lastColumn="0" w:lastRow="0" w:noHBand="0" w:noVBand="1" w:val="04A0"/>
+      </w:tblPr>
+      <w:tblGrid>
+        <w:gridCol w:w="941"/>
+        <w:gridCol w:w="941"/>
+        <w:gridCol w:w="941"/>
+        <w:gridCol w:w="941"/>
+        <w:gridCol w:w="941"/>
+        <w:gridCol w:w="941"/>
+        <w:gridCol w:w="941"/>
+        <w:gridCol w:w="941"/>
+        <w:gridCol w:w="941"/>
+        <w:gridCol w:w="941"/>
+      </w:tblGrid>
+      <w:tr>
+        <w:tc>
+          <w:tcPr>
+            <w:tcW w:type="dxa" w:w="1984"/>
+            <w:shd w:fill="D9D9D9"/>
+          </w:tcPr>
+          <w:p>
+            <w:pPr>
+              <w:jc w:val="center"/>
+            </w:pPr>
+            <w:r/>
+            <w:r>
+              <w:rPr>
+                <w:rFonts w:ascii="Times New Roman" w:hAnsi="Times New Roman"/>
+                <w:b/>
+                <w:sz w:val="17"/>
+              </w:rPr>
+              <w:t>Balance Point</w:t>
+            </w:r>
+          </w:p>
+        </w:tc>
+        <w:tc>
+          <w:tcPr>
+            <w:tcW w:type="dxa" w:w="850"/>
+            <w:shd w:fill="D9D9D9"/>
+          </w:tcPr>
+          <w:p>
+            <w:pPr>
+              <w:jc w:val="center"/>
+            </w:pPr>
+            <w:r/>
+            <w:r>
+              <w:rPr>
+                <w:rFonts w:ascii="Times New Roman" w:hAnsi="Times New Roman"/>
+                <w:b/>
+                <w:sz w:val="17"/>
+              </w:rPr>
+              <w:t>IUSAF %</w:t>
+            </w:r>
+          </w:p>
+        </w:tc>
+        <w:tc>
+          <w:tcPr>
+            <w:tcW w:type="dxa" w:w="850"/>
+            <w:shd w:fill="D9D9D9"/>
+          </w:tcPr>
+          <w:p>
+            <w:pPr>
+              <w:jc w:val="center"/>
+            </w:pPr>
+            <w:r/>
+            <w:r>
+              <w:rPr>
+                <w:rFonts w:ascii="Times New Roman" w:hAnsi="Times New Roman"/>
+                <w:b/>
+                <w:sz w:val="17"/>
+              </w:rPr>
+              <w:t>TSAC %</w:t>
+            </w:r>
+          </w:p>
+        </w:tc>
+        <w:tc>
+          <w:tcPr>
+            <w:tcW w:type="dxa" w:w="850"/>
+            <w:shd w:fill="D9D9D9"/>
+          </w:tcPr>
+          <w:p>
+            <w:pPr>
+              <w:jc w:val="center"/>
+            </w:pPr>
+            <w:r/>
+            <w:r>
+              <w:rPr>
+                <w:rFonts w:ascii="Times New Roman" w:hAnsi="Times New Roman"/>
+                <w:b/>
+                <w:sz w:val="17"/>
+              </w:rPr>
+              <w:t>SOSAC %</w:t>
+            </w:r>
+          </w:p>
+        </w:tc>
+        <w:tc>
+          <w:tcPr>
+            <w:tcW w:type="dxa" w:w="1247"/>
+            <w:shd w:fill="D9D9D9"/>
+          </w:tcPr>
+          <w:p>
+            <w:pPr>
+              <w:jc w:val="center"/>
+            </w:pPr>
+            <w:r/>
+            <w:r>
+              <w:rPr>
+                <w:rFonts w:ascii="Times New Roman" w:hAnsi="Times New Roman"/>
+                <w:b/>
+                <w:sz w:val="17"/>
+              </w:rPr>
+              <w:t>$50m</w:t>
+            </w:r>
+            <w:r>
+              <w:br/>
+            </w:r>
+            <w:r>
+              <w:rPr>
+                <w:rFonts w:ascii="Times New Roman" w:hAnsi="Times New Roman"/>
+                <w:b/>
+                <w:sz w:val="17"/>
+              </w:rPr>
+              <w:t>IUSAF|TSAC|SOSAC</w:t>
+            </w:r>
+            <w:r>
+              <w:br/>
+            </w:r>
+            <w:r>
+              <w:rPr>
+                <w:rFonts w:ascii="Times New Roman" w:hAnsi="Times New Roman"/>
+                <w:b/>
+                <w:sz w:val="17"/>
+              </w:rPr>
+              <w:t>(USD M)</w:t>
+            </w:r>
+          </w:p>
+        </w:tc>
+        <w:tc>
+          <w:tcPr>
+            <w:tcW w:type="dxa" w:w="1247"/>
+            <w:shd w:fill="D9D9D9"/>
+          </w:tcPr>
+          <w:p>
+            <w:pPr>
+              <w:jc w:val="center"/>
+            </w:pPr>
+            <w:r/>
+            <w:r>
+              <w:rPr>
+                <w:rFonts w:ascii="Times New Roman" w:hAnsi="Times New Roman"/>
+                <w:b/>
+                <w:sz w:val="17"/>
+              </w:rPr>
+              <w:t>$200m</w:t>
+            </w:r>
+            <w:r>
+              <w:br/>
+            </w:r>
+            <w:r>
+              <w:rPr>
+                <w:rFonts w:ascii="Times New Roman" w:hAnsi="Times New Roman"/>
+                <w:b/>
+                <w:sz w:val="17"/>
+              </w:rPr>
+              <w:t>IUSAF|TSAC|SOSAC</w:t>
+            </w:r>
+            <w:r>
+              <w:br/>
+            </w:r>
+            <w:r>
+              <w:rPr>
+                <w:rFonts w:ascii="Times New Roman" w:hAnsi="Times New Roman"/>
+                <w:b/>
+                <w:sz w:val="17"/>
+              </w:rPr>
+              <w:t>(USD M)</w:t>
+            </w:r>
+          </w:p>
+        </w:tc>
+        <w:tc>
+          <w:tcPr>
+            <w:tcW w:type="dxa" w:w="1247"/>
+            <w:shd w:fill="D9D9D9"/>
+          </w:tcPr>
+          <w:p>
+            <w:pPr>
+              <w:jc w:val="center"/>
+            </w:pPr>
+            <w:r/>
+            <w:r>
+              <w:rPr>
+                <w:rFonts w:ascii="Times New Roman" w:hAnsi="Times New Roman"/>
+                <w:b/>
+                <w:sz w:val="17"/>
+              </w:rPr>
+              <w:t>$500m</w:t>
+            </w:r>
+            <w:r>
+              <w:br/>
+            </w:r>
+            <w:r>
+              <w:rPr>
+                <w:rFonts w:ascii="Times New Roman" w:hAnsi="Times New Roman"/>
+                <w:b/>
+                <w:sz w:val="17"/>
+              </w:rPr>
+              <w:t>IUSAF|TSAC|SOSAC</w:t>
+            </w:r>
+            <w:r>
+              <w:br/>
+            </w:r>
+            <w:r>
+              <w:rPr>
+                <w:rFonts w:ascii="Times New Roman" w:hAnsi="Times New Roman"/>
+                <w:b/>
+                <w:sz w:val="17"/>
+              </w:rPr>
+              <w:t>(USD M)</w:t>
+            </w:r>
+          </w:p>
+        </w:tc>
+        <w:tc>
+          <w:tcPr>
+            <w:tcW w:type="dxa" w:w="1247"/>
+            <w:shd w:fill="D9D9D9"/>
+          </w:tcPr>
+          <w:p>
+            <w:pPr>
+              <w:jc w:val="center"/>
+            </w:pPr>
+            <w:r/>
+            <w:r>
+              <w:rPr>
+                <w:rFonts w:ascii="Times New Roman" w:hAnsi="Times New Roman"/>
+                <w:b/>
+                <w:sz w:val="17"/>
+              </w:rPr>
+              <w:t>$1bn</w:t>
+            </w:r>
+            <w:r>
+              <w:br/>
+            </w:r>
+            <w:r>
+              <w:rPr>
+                <w:rFonts w:ascii="Times New Roman" w:hAnsi="Times New Roman"/>
+                <w:b/>
+                <w:sz w:val="17"/>
+              </w:rPr>
+              <w:t>IUSAF|TSAC|SOSAC</w:t>
+            </w:r>
+            <w:r>
+              <w:br/>
+            </w:r>
+            <w:r>
+              <w:rPr>
+                <w:rFonts w:ascii="Times New Roman" w:hAnsi="Times New Roman"/>
+                <w:b/>
+                <w:sz w:val="17"/>
+              </w:rPr>
+              <w:t>(USD M)</w:t>
+            </w:r>
+          </w:p>
+        </w:tc>
+        <w:tc>
+          <w:tcPr>
+            <w:tcW w:type="dxa" w:w="1247"/>
+            <w:shd w:fill="D9D9D9"/>
+          </w:tcPr>
+          <w:p>
+            <w:pPr>
+              <w:jc w:val="center"/>
+            </w:pPr>
+            <w:r/>
+            <w:r>
+              <w:rPr>
+                <w:rFonts w:ascii="Times New Roman" w:hAnsi="Times New Roman"/>
+                <w:b/>
+                <w:sz w:val="17"/>
+              </w:rPr>
+              <w:t>$5bn</w:t>
+            </w:r>
+            <w:r>
+              <w:br/>
+            </w:r>
+            <w:r>
+              <w:rPr>
+                <w:rFonts w:ascii="Times New Roman" w:hAnsi="Times New Roman"/>
+                <w:b/>
+                <w:sz w:val="17"/>
+              </w:rPr>
+              <w:t>IUSAF|TSAC|SOSAC</w:t>
+            </w:r>
+            <w:r>
+              <w:br/>
+            </w:r>
+            <w:r>
+              <w:rPr>
+                <w:rFonts w:ascii="Times New Roman" w:hAnsi="Times New Roman"/>
+                <w:b/>
+                <w:sz w:val="17"/>
+              </w:rPr>
+              <w:t>(USD M)</w:t>
+            </w:r>
+          </w:p>
+        </w:tc>
+        <w:tc>
+          <w:tcPr>
+            <w:tcW w:type="dxa" w:w="1247"/>
+            <w:shd w:fill="D9D9D9"/>
+          </w:tcPr>
+          <w:p>
+            <w:pPr>
+              <w:jc w:val="center"/>
+            </w:pPr>
+            <w:r/>
+            <w:r>
+              <w:rPr>
+                <w:rFonts w:ascii="Times New Roman" w:hAnsi="Times New Roman"/>
+                <w:b/>
+                <w:sz w:val="17"/>
+              </w:rPr>
+              <w:t>$10bn</w:t>
+            </w:r>
+            <w:r>
+              <w:br/>
+            </w:r>
+            <w:r>
+              <w:rPr>
+                <w:rFonts w:ascii="Times New Roman" w:hAnsi="Times New Roman"/>
+                <w:b/>
+                <w:sz w:val="17"/>
+              </w:rPr>
+              <w:t>IUSAF|TSAC|SOSAC</w:t>
+            </w:r>
+            <w:r>
+              <w:br/>
+            </w:r>
+            <w:r>
+              <w:rPr>
+                <w:rFonts w:ascii="Times New Roman" w:hAnsi="Times New Roman"/>
+                <w:b/>
+                <w:sz w:val="17"/>
+              </w:rPr>
+              <w:t>(USD M)</w:t>
+            </w:r>
+          </w:p>
+        </w:tc>
+      </w:tr>
+      <w:tr>
+        <w:tc>
+          <w:tcPr>
+            <w:tcW w:type="dxa" w:w="1984"/>
+          </w:tcPr>
+          <w:p>
+            <w:pPr>
+              <w:jc w:val="center"/>
+            </w:pPr>
+            <w:r/>
+            <w:r>
+              <w:rPr>
+                <w:rFonts w:ascii="Times New Roman" w:hAnsi="Times New Roman"/>
+                <w:sz w:val="17"/>
+              </w:rPr>
+              <w:t>Strict (1.5%, 3%)</w:t>
+            </w:r>
+          </w:p>
+        </w:tc>
+        <w:tc>
+          <w:tcPr>
+            <w:tcW w:type="dxa" w:w="850"/>
+          </w:tcPr>
+          <w:p>
+            <w:pPr>
+              <w:jc w:val="center"/>
+            </w:pPr>
+            <w:r/>
+            <w:r>
+              <w:rPr>
+                <w:rFonts w:ascii="Times New Roman" w:hAnsi="Times New Roman"/>
+                <w:sz w:val="17"/>
+              </w:rPr>
+              <w:t>95.5%</w:t>
+            </w:r>
+          </w:p>
+        </w:tc>
+        <w:tc>
+          <w:tcPr>
+            <w:tcW w:type="dxa" w:w="850"/>
+          </w:tcPr>
+          <w:p>
+            <w:pPr>
+              <w:jc w:val="center"/>
+            </w:pPr>
+            <w:r/>
+            <w:r>
+              <w:rPr>
+                <w:rFonts w:ascii="Times New Roman" w:hAnsi="Times New Roman"/>
+                <w:sz w:val="17"/>
+              </w:rPr>
+              <w:t>1.5%</w:t>
+            </w:r>
+          </w:p>
+        </w:tc>
+        <w:tc>
+          <w:tcPr>
+            <w:tcW w:type="dxa" w:w="850"/>
+          </w:tcPr>
+          <w:p>
+            <w:pPr>
+              <w:jc w:val="center"/>
+            </w:pPr>
+            <w:r/>
+            <w:r>
+              <w:rPr>
+                <w:rFonts w:ascii="Times New Roman" w:hAnsi="Times New Roman"/>
+                <w:sz w:val="17"/>
+              </w:rPr>
+              <w:t>3%</w:t>
+            </w:r>
+          </w:p>
+        </w:tc>
+        <w:tc>
+          <w:tcPr>
+            <w:tcW w:type="dxa" w:w="1247"/>
+          </w:tcPr>
+          <w:p>
+            <w:pPr>
+              <w:jc w:val="center"/>
+            </w:pPr>
+            <w:r/>
+            <w:r>
+              <w:rPr>
+                <w:rFonts w:ascii="Times New Roman" w:hAnsi="Times New Roman"/>
+                <w:sz w:val="17"/>
+              </w:rPr>
+              <w:t>47.8|0.8|1.5</w:t>
+            </w:r>
+          </w:p>
+        </w:tc>
+        <w:tc>
+          <w:tcPr>
+            <w:tcW w:type="dxa" w:w="1247"/>
+          </w:tcPr>
+          <w:p>
+            <w:pPr>
+              <w:jc w:val="center"/>
+            </w:pPr>
+            <w:r/>
+            <w:r>
+              <w:rPr>
+                <w:rFonts w:ascii="Times New Roman" w:hAnsi="Times New Roman"/>
+                <w:sz w:val="17"/>
+              </w:rPr>
+              <w:t>191.0|3.0|6.0</w:t>
+            </w:r>
+          </w:p>
+        </w:tc>
+        <w:tc>
+          <w:tcPr>
+            <w:tcW w:type="dxa" w:w="1247"/>
+          </w:tcPr>
+          <w:p>
+            <w:pPr>
+              <w:jc w:val="center"/>
+            </w:pPr>
+            <w:r/>
+            <w:r>
+              <w:rPr>
+                <w:rFonts w:ascii="Times New Roman" w:hAnsi="Times New Roman"/>
+                <w:sz w:val="17"/>
+              </w:rPr>
+              <w:t>477.5|7.5|15.0</w:t>
+            </w:r>
+          </w:p>
+        </w:tc>
+        <w:tc>
+          <w:tcPr>
+            <w:tcW w:type="dxa" w:w="1247"/>
+          </w:tcPr>
+          <w:p>
+            <w:pPr>
+              <w:jc w:val="center"/>
+            </w:pPr>
+            <w:r/>
+            <w:r>
+              <w:rPr>
+                <w:rFonts w:ascii="Times New Roman" w:hAnsi="Times New Roman"/>
+                <w:sz w:val="17"/>
+              </w:rPr>
+              <w:t>955.0|15.0|30.0</w:t>
+            </w:r>
+          </w:p>
+        </w:tc>
+        <w:tc>
+          <w:tcPr>
+            <w:tcW w:type="dxa" w:w="1247"/>
+          </w:tcPr>
+          <w:p>
+            <w:pPr>
+              <w:jc w:val="center"/>
+            </w:pPr>
+            <w:r/>
+            <w:r>
+              <w:rPr>
+                <w:rFonts w:ascii="Times New Roman" w:hAnsi="Times New Roman"/>
+                <w:sz w:val="17"/>
+              </w:rPr>
+              <w:t>4775.0|75.0|150.0</w:t>
+            </w:r>
+          </w:p>
+        </w:tc>
+        <w:tc>
+          <w:tcPr>
+            <w:tcW w:type="dxa" w:w="1247"/>
+          </w:tcPr>
+          <w:p>
+            <w:pPr>
+              <w:jc w:val="left"/>
+            </w:pPr>
+            <w:r/>
+            <w:r>
+              <w:rPr>
+                <w:rFonts w:ascii="Times New Roman" w:hAnsi="Times New Roman"/>
+                <w:sz w:val="17"/>
+              </w:rPr>
+              <w:t>9550.0|150.0|300.0</w:t>
+            </w:r>
+          </w:p>
+        </w:tc>
+      </w:tr>
+      <w:tr>
+        <w:tc>
+          <w:tcPr>
+            <w:tcW w:type="dxa" w:w="1984"/>
+          </w:tcPr>
+          <w:p>
+            <w:pPr>
+              <w:jc w:val="center"/>
+            </w:pPr>
+            <w:r/>
+            <w:r>
+              <w:rPr>
+                <w:rFonts w:ascii="Times New Roman" w:hAnsi="Times New Roman"/>
+                <w:sz w:val="17"/>
+              </w:rPr>
+              <w:t>Gini-minimum (2.5%, 3%)</w:t>
+            </w:r>
+          </w:p>
+        </w:tc>
+        <w:tc>
+          <w:tcPr>
+            <w:tcW w:type="dxa" w:w="850"/>
+          </w:tcPr>
+          <w:p>
+            <w:pPr>
+              <w:jc w:val="center"/>
+            </w:pPr>
+            <w:r/>
+            <w:r>
+              <w:rPr>
+                <w:rFonts w:ascii="Times New Roman" w:hAnsi="Times New Roman"/>
+                <w:sz w:val="17"/>
+              </w:rPr>
+              <w:t>94.5%</w:t>
+            </w:r>
+          </w:p>
+        </w:tc>
+        <w:tc>
+          <w:tcPr>
+            <w:tcW w:type="dxa" w:w="850"/>
+          </w:tcPr>
+          <w:p>
+            <w:pPr>
+              <w:jc w:val="center"/>
+            </w:pPr>
+            <w:r/>
+            <w:r>
+              <w:rPr>
+                <w:rFonts w:ascii="Times New Roman" w:hAnsi="Times New Roman"/>
+                <w:sz w:val="17"/>
+              </w:rPr>
+              <w:t>2.5%</w:t>
+            </w:r>
+          </w:p>
+        </w:tc>
+        <w:tc>
+          <w:tcPr>
+            <w:tcW w:type="dxa" w:w="850"/>
+          </w:tcPr>
+          <w:p>
+            <w:pPr>
+              <w:jc w:val="center"/>
+            </w:pPr>
+            <w:r/>
+            <w:r>
+              <w:rPr>
+                <w:rFonts w:ascii="Times New Roman" w:hAnsi="Times New Roman"/>
+                <w:sz w:val="17"/>
+              </w:rPr>
+              <w:t>3%</w:t>
+            </w:r>
+          </w:p>
+        </w:tc>
+        <w:tc>
+          <w:tcPr>
+            <w:tcW w:type="dxa" w:w="1247"/>
+          </w:tcPr>
+          <w:p>
+            <w:pPr>
+              <w:jc w:val="center"/>
+            </w:pPr>
+            <w:r/>
+            <w:r>
+              <w:rPr>
+                <w:rFonts w:ascii="Times New Roman" w:hAnsi="Times New Roman"/>
+                <w:sz w:val="17"/>
+              </w:rPr>
+              <w:t>47.2|1.2|1.5</w:t>
+            </w:r>
+          </w:p>
+        </w:tc>
+        <w:tc>
+          <w:tcPr>
+            <w:tcW w:type="dxa" w:w="1247"/>
+          </w:tcPr>
+          <w:p>
+            <w:pPr>
+              <w:jc w:val="center"/>
+            </w:pPr>
+            <w:r/>
+            <w:r>
+              <w:rPr>
+                <w:rFonts w:ascii="Times New Roman" w:hAnsi="Times New Roman"/>
+                <w:sz w:val="17"/>
+              </w:rPr>
+              <w:t>189.0|5.0|6.0</w:t>
+            </w:r>
+          </w:p>
+        </w:tc>
+        <w:tc>
+          <w:tcPr>
+            <w:tcW w:type="dxa" w:w="1247"/>
+          </w:tcPr>
+          <w:p>
+            <w:pPr>
+              <w:jc w:val="center"/>
+            </w:pPr>
+            <w:r/>
+            <w:r>
+              <w:rPr>
+                <w:rFonts w:ascii="Times New Roman" w:hAnsi="Times New Roman"/>
+                <w:sz w:val="17"/>
+              </w:rPr>
+              <w:t>472.5|12.5|15.0</w:t>
+            </w:r>
+          </w:p>
+        </w:tc>
+        <w:tc>
+          <w:tcPr>
+            <w:tcW w:type="dxa" w:w="1247"/>
+          </w:tcPr>
+          <w:p>
+            <w:pPr>
+              <w:jc w:val="center"/>
+            </w:pPr>
+            <w:r/>
+            <w:r>
+              <w:rPr>
+                <w:rFonts w:ascii="Times New Roman" w:hAnsi="Times New Roman"/>
+                <w:sz w:val="17"/>
+              </w:rPr>
+              <w:t>945.0|25.0|30.0</w:t>
+            </w:r>
+          </w:p>
+        </w:tc>
+        <w:tc>
+          <w:tcPr>
+            <w:tcW w:type="dxa" w:w="1247"/>
+          </w:tcPr>
+          <w:p>
+            <w:pPr>
+              <w:jc w:val="center"/>
+            </w:pPr>
+            <w:r/>
+            <w:r>
+              <w:rPr>
+                <w:rFonts w:ascii="Times New Roman" w:hAnsi="Times New Roman"/>
+                <w:sz w:val="17"/>
+              </w:rPr>
+              <w:t>4725.0|125.0|150.0</w:t>
+            </w:r>
+          </w:p>
+        </w:tc>
+        <w:tc>
+          <w:tcPr>
+            <w:tcW w:type="dxa" w:w="1247"/>
+          </w:tcPr>
+          <w:p>
+            <w:pPr>
+              <w:jc w:val="left"/>
+            </w:pPr>
+            <w:r/>
+            <w:r>
+              <w:rPr>
+                <w:rFonts w:ascii="Times New Roman" w:hAnsi="Times New Roman"/>
+                <w:sz w:val="17"/>
+              </w:rPr>
+              <w:t>9450.0|250.0|300.0</w:t>
+            </w:r>
+          </w:p>
+        </w:tc>
+      </w:tr>
+      <w:tr>
+        <w:tc>
+          <w:tcPr>
+            <w:tcW w:type="dxa" w:w="1984"/>
+          </w:tcPr>
+          <w:p>
+            <w:pPr>
+              <w:jc w:val="center"/>
+            </w:pPr>
+            <w:r/>
+            <w:r>
+              <w:rPr>
+                <w:rFonts w:ascii="Times New Roman" w:hAnsi="Times New Roman"/>
+                <w:sz w:val="17"/>
+              </w:rPr>
+              <w:t>Band-order boundary (3.0%, 3%)</w:t>
+            </w:r>
+          </w:p>
+        </w:tc>
+        <w:tc>
+          <w:tcPr>
+            <w:tcW w:type="dxa" w:w="850"/>
+          </w:tcPr>
+          <w:p>
+            <w:pPr>
+              <w:jc w:val="center"/>
+            </w:pPr>
+            <w:r/>
+            <w:r>
+              <w:rPr>
+                <w:rFonts w:ascii="Times New Roman" w:hAnsi="Times New Roman"/>
+                <w:sz w:val="17"/>
+              </w:rPr>
+              <w:t>94.0%</w:t>
+            </w:r>
+          </w:p>
+        </w:tc>
+        <w:tc>
+          <w:tcPr>
+            <w:tcW w:type="dxa" w:w="850"/>
+          </w:tcPr>
+          <w:p>
+            <w:pPr>
+              <w:jc w:val="center"/>
+            </w:pPr>
+            <w:r/>
+            <w:r>
+              <w:rPr>
+                <w:rFonts w:ascii="Times New Roman" w:hAnsi="Times New Roman"/>
+                <w:sz w:val="17"/>
+              </w:rPr>
+              <w:t>3.0%</w:t>
+            </w:r>
+          </w:p>
+        </w:tc>
+        <w:tc>
+          <w:tcPr>
+            <w:tcW w:type="dxa" w:w="850"/>
+          </w:tcPr>
+          <w:p>
+            <w:pPr>
+              <w:jc w:val="center"/>
+            </w:pPr>
+            <w:r/>
+            <w:r>
+              <w:rPr>
+                <w:rFonts w:ascii="Times New Roman" w:hAnsi="Times New Roman"/>
+                <w:sz w:val="17"/>
+              </w:rPr>
+              <w:t>3%</w:t>
+            </w:r>
+          </w:p>
+        </w:tc>
+        <w:tc>
+          <w:tcPr>
+            <w:tcW w:type="dxa" w:w="1247"/>
+          </w:tcPr>
+          <w:p>
+            <w:pPr>
+              <w:jc w:val="center"/>
+            </w:pPr>
+            <w:r/>
+            <w:r>
+              <w:rPr>
+                <w:rFonts w:ascii="Times New Roman" w:hAnsi="Times New Roman"/>
+                <w:sz w:val="17"/>
+              </w:rPr>
+              <w:t>47.0|1.5|1.5</w:t>
+            </w:r>
+          </w:p>
+        </w:tc>
+        <w:tc>
+          <w:tcPr>
+            <w:tcW w:type="dxa" w:w="1247"/>
+          </w:tcPr>
+          <w:p>
+            <w:pPr>
+              <w:jc w:val="center"/>
+            </w:pPr>
+            <w:r/>
+            <w:r>
+              <w:rPr>
+                <w:rFonts w:ascii="Times New Roman" w:hAnsi="Times New Roman"/>
+                <w:sz w:val="17"/>
+              </w:rPr>
+              <w:t>188.0|6.0|6.0</w:t>
+            </w:r>
+          </w:p>
+        </w:tc>
+        <w:tc>
+          <w:tcPr>
+            <w:tcW w:type="dxa" w:w="1247"/>
+          </w:tcPr>
+          <w:p>
+            <w:pPr>
+              <w:jc w:val="center"/>
+            </w:pPr>
+            <w:r/>
+            <w:r>
+              <w:rPr>
+                <w:rFonts w:ascii="Times New Roman" w:hAnsi="Times New Roman"/>
+                <w:sz w:val="17"/>
+              </w:rPr>
+              <w:t>470.0|15.0|15.0</w:t>
+            </w:r>
+          </w:p>
+        </w:tc>
+        <w:tc>
+          <w:tcPr>
+            <w:tcW w:type="dxa" w:w="1247"/>
+          </w:tcPr>
+          <w:p>
+            <w:pPr>
+              <w:jc w:val="center"/>
+            </w:pPr>
+            <w:r/>
+            <w:r>
+              <w:rPr>
+                <w:rFonts w:ascii="Times New Roman" w:hAnsi="Times New Roman"/>
+                <w:sz w:val="17"/>
+              </w:rPr>
+              <w:t>940.0|30.0|30.0</w:t>
+            </w:r>
+          </w:p>
+        </w:tc>
+        <w:tc>
+          <w:tcPr>
+            <w:tcW w:type="dxa" w:w="1247"/>
+          </w:tcPr>
+          <w:p>
+            <w:pPr>
+              <w:jc w:val="center"/>
+            </w:pPr>
+            <w:r/>
+            <w:r>
+              <w:rPr>
+                <w:rFonts w:ascii="Times New Roman" w:hAnsi="Times New Roman"/>
+                <w:sz w:val="17"/>
+              </w:rPr>
+              <w:t>4700.0|150.0|150.0</w:t>
+            </w:r>
+          </w:p>
+        </w:tc>
+        <w:tc>
+          <w:tcPr>
+            <w:tcW w:type="dxa" w:w="1247"/>
+          </w:tcPr>
+          <w:p>
+            <w:pPr>
+              <w:jc w:val="left"/>
+            </w:pPr>
+            <w:r/>
+            <w:r>
+              <w:rPr>
+                <w:rFonts w:ascii="Times New Roman" w:hAnsi="Times New Roman"/>
+                <w:sz w:val="17"/>
+              </w:rPr>
+              <w:t>9400.0|300.0|300.0</w:t>
+            </w:r>
+          </w:p>
+        </w:tc>
+      </w:tr>
+    </w:tbl>
+    <w:p>
+      <w:pPr>
+        <w:jc w:val="center"/>
+      </w:pPr>
+      <w:r>
+        <w:rPr>
+          <w:rFonts w:ascii="Times New Roman" w:hAnsi="Times New Roman"/>
+          <w:i/>
+          <w:sz w:val="17"/>
+        </w:rPr>
+        <w:t>Table E1. Component allocation by balance point and fund size (USD millions, IUSAF | TSAC | SOSAC)</w:t>
+      </w:r>
+    </w:p>
+    <w:p/>
+    <w:p>
+      <w:pPr>
+        <w:spacing w:after="120"/>
+      </w:pPr>
+      <w:r>
+        <w:t>Table E2 shows the total stewardship pool (TSAC + SOSAC) under each balance point, making clear the amount 'in play' at different fund sizes.</w:t>
+      </w:r>
+    </w:p>
+    <w:tbl>
+      <w:tblPr>
+        <w:tblStyle w:val="TableGrid"/>
+        <w:tblW w:type="auto" w:w="0"/>
+        <w:jc w:val="center"/>
+        <w:tblLook w:firstColumn="1" w:firstRow="1" w:lastColumn="0" w:lastRow="0" w:noHBand="0" w:noVBand="1" w:val="04A0"/>
+      </w:tblPr>
+      <w:tblGrid>
+        <w:gridCol w:w="1176"/>
+        <w:gridCol w:w="1176"/>
+        <w:gridCol w:w="1176"/>
+        <w:gridCol w:w="1176"/>
+        <w:gridCol w:w="1176"/>
+        <w:gridCol w:w="1176"/>
+        <w:gridCol w:w="1176"/>
+        <w:gridCol w:w="1176"/>
+      </w:tblGrid>
+      <w:tr>
+        <w:tc>
+          <w:tcPr>
+            <w:tcW w:type="dxa" w:w="1984"/>
+            <w:shd w:fill="D9D9D9"/>
+          </w:tcPr>
+          <w:p>
+            <w:pPr>
+              <w:jc w:val="center"/>
+            </w:pPr>
+            <w:r/>
+            <w:r>
+              <w:rPr>
+                <w:rFonts w:ascii="Times New Roman" w:hAnsi="Times New Roman"/>
+                <w:b/>
+                <w:sz w:val="17"/>
+              </w:rPr>
+              <w:t>Balance Point</w:t>
+            </w:r>
+          </w:p>
+        </w:tc>
+        <w:tc>
+          <w:tcPr>
+            <w:tcW w:type="dxa" w:w="850"/>
+            <w:shd w:fill="D9D9D9"/>
+          </w:tcPr>
+          <w:p>
+            <w:pPr>
+              <w:jc w:val="center"/>
+            </w:pPr>
+            <w:r/>
+            <w:r>
+              <w:rPr>
+                <w:rFonts w:ascii="Times New Roman" w:hAnsi="Times New Roman"/>
+                <w:b/>
+                <w:sz w:val="17"/>
+              </w:rPr>
+              <w:t>Pool %</w:t>
+            </w:r>
+          </w:p>
+        </w:tc>
+        <w:tc>
+          <w:tcPr>
+            <w:tcW w:type="dxa" w:w="1134"/>
+            <w:shd w:fill="D9D9D9"/>
+          </w:tcPr>
+          <w:p>
+            <w:pPr>
+              <w:jc w:val="center"/>
+            </w:pPr>
+            <w:r/>
+            <w:r>
+              <w:rPr>
+                <w:rFonts w:ascii="Times New Roman" w:hAnsi="Times New Roman"/>
+                <w:b/>
+                <w:sz w:val="17"/>
+              </w:rPr>
+              <w:t>Pool at</w:t>
+            </w:r>
+            <w:r>
+              <w:br/>
+            </w:r>
+            <w:r>
+              <w:rPr>
+                <w:rFonts w:ascii="Times New Roman" w:hAnsi="Times New Roman"/>
+                <w:b/>
+                <w:sz w:val="17"/>
+              </w:rPr>
+              <w:t>$50m</w:t>
+            </w:r>
+          </w:p>
+        </w:tc>
+        <w:tc>
+          <w:tcPr>
+            <w:tcW w:type="dxa" w:w="1134"/>
+            <w:shd w:fill="D9D9D9"/>
+          </w:tcPr>
+          <w:p>
+            <w:pPr>
+              <w:jc w:val="center"/>
+            </w:pPr>
+            <w:r/>
+            <w:r>
+              <w:rPr>
+                <w:rFonts w:ascii="Times New Roman" w:hAnsi="Times New Roman"/>
+                <w:b/>
+                <w:sz w:val="17"/>
+              </w:rPr>
+              <w:t>Pool at</w:t>
+            </w:r>
+            <w:r>
+              <w:br/>
+            </w:r>
+            <w:r>
+              <w:rPr>
+                <w:rFonts w:ascii="Times New Roman" w:hAnsi="Times New Roman"/>
+                <w:b/>
+                <w:sz w:val="17"/>
+              </w:rPr>
+              <w:t>$200m</w:t>
+            </w:r>
+          </w:p>
+        </w:tc>
+        <w:tc>
+          <w:tcPr>
+            <w:tcW w:type="dxa" w:w="1134"/>
+            <w:shd w:fill="D9D9D9"/>
+          </w:tcPr>
+          <w:p>
+            <w:pPr>
+              <w:jc w:val="center"/>
+            </w:pPr>
+            <w:r/>
+            <w:r>
+              <w:rPr>
+                <w:rFonts w:ascii="Times New Roman" w:hAnsi="Times New Roman"/>
+                <w:b/>
+                <w:sz w:val="17"/>
+              </w:rPr>
+              <w:t>Pool at</w:t>
+            </w:r>
+            <w:r>
+              <w:br/>
+            </w:r>
+            <w:r>
+              <w:rPr>
+                <w:rFonts w:ascii="Times New Roman" w:hAnsi="Times New Roman"/>
+                <w:b/>
+                <w:sz w:val="17"/>
+              </w:rPr>
+              <w:t>$500m</w:t>
+            </w:r>
+          </w:p>
+        </w:tc>
+        <w:tc>
+          <w:tcPr>
+            <w:tcW w:type="dxa" w:w="1134"/>
+            <w:shd w:fill="D9D9D9"/>
+          </w:tcPr>
+          <w:p>
+            <w:pPr>
+              <w:jc w:val="center"/>
+            </w:pPr>
+            <w:r/>
+            <w:r>
+              <w:rPr>
+                <w:rFonts w:ascii="Times New Roman" w:hAnsi="Times New Roman"/>
+                <w:b/>
+                <w:sz w:val="17"/>
+              </w:rPr>
+              <w:t>Pool at</w:t>
+            </w:r>
+            <w:r>
+              <w:br/>
+            </w:r>
+            <w:r>
+              <w:rPr>
+                <w:rFonts w:ascii="Times New Roman" w:hAnsi="Times New Roman"/>
+                <w:b/>
+                <w:sz w:val="17"/>
+              </w:rPr>
+              <w:t>$1bn</w:t>
+            </w:r>
+          </w:p>
+        </w:tc>
+        <w:tc>
+          <w:tcPr>
+            <w:tcW w:type="dxa" w:w="1134"/>
+            <w:shd w:fill="D9D9D9"/>
+          </w:tcPr>
+          <w:p>
+            <w:pPr>
+              <w:jc w:val="center"/>
+            </w:pPr>
+            <w:r/>
+            <w:r>
+              <w:rPr>
+                <w:rFonts w:ascii="Times New Roman" w:hAnsi="Times New Roman"/>
+                <w:b/>
+                <w:sz w:val="17"/>
+              </w:rPr>
+              <w:t>Pool at</w:t>
+            </w:r>
+            <w:r>
+              <w:br/>
+            </w:r>
+            <w:r>
+              <w:rPr>
+                <w:rFonts w:ascii="Times New Roman" w:hAnsi="Times New Roman"/>
+                <w:b/>
+                <w:sz w:val="17"/>
+              </w:rPr>
+              <w:t>$5bn</w:t>
+            </w:r>
+          </w:p>
+        </w:tc>
+        <w:tc>
+          <w:tcPr>
+            <w:tcW w:type="dxa" w:w="1134"/>
+            <w:shd w:fill="D9D9D9"/>
+          </w:tcPr>
+          <w:p>
+            <w:pPr>
+              <w:jc w:val="center"/>
+            </w:pPr>
+            <w:r/>
+            <w:r>
+              <w:rPr>
+                <w:rFonts w:ascii="Times New Roman" w:hAnsi="Times New Roman"/>
+                <w:b/>
+                <w:sz w:val="17"/>
+              </w:rPr>
+              <w:t>Pool at</w:t>
+            </w:r>
+            <w:r>
+              <w:br/>
+            </w:r>
+            <w:r>
+              <w:rPr>
+                <w:rFonts w:ascii="Times New Roman" w:hAnsi="Times New Roman"/>
+                <w:b/>
+                <w:sz w:val="17"/>
+              </w:rPr>
+              <w:t>$10bn</w:t>
+            </w:r>
+          </w:p>
+        </w:tc>
+      </w:tr>
+      <w:tr>
+        <w:tc>
+          <w:tcPr>
+            <w:tcW w:type="dxa" w:w="1984"/>
+          </w:tcPr>
+          <w:p>
+            <w:pPr>
+              <w:jc w:val="center"/>
+            </w:pPr>
+            <w:r/>
+            <w:r>
+              <w:rPr>
+                <w:rFonts w:ascii="Times New Roman" w:hAnsi="Times New Roman"/>
+                <w:sz w:val="17"/>
+              </w:rPr>
+              <w:t>Strict (1.5%, 3%)</w:t>
+            </w:r>
+          </w:p>
+        </w:tc>
+        <w:tc>
+          <w:tcPr>
+            <w:tcW w:type="dxa" w:w="850"/>
+          </w:tcPr>
+          <w:p>
+            <w:pPr>
+              <w:jc w:val="center"/>
+            </w:pPr>
+            <w:r/>
+            <w:r>
+              <w:rPr>
+                <w:rFonts w:ascii="Times New Roman" w:hAnsi="Times New Roman"/>
+                <w:sz w:val="17"/>
+              </w:rPr>
+              <w:t>4.5%</w:t>
+            </w:r>
+          </w:p>
+        </w:tc>
+        <w:tc>
+          <w:tcPr>
+            <w:tcW w:type="dxa" w:w="1134"/>
+          </w:tcPr>
+          <w:p>
+            <w:pPr>
+              <w:jc w:val="center"/>
+            </w:pPr>
+            <w:r/>
+            <w:r>
+              <w:rPr>
+                <w:rFonts w:ascii="Times New Roman" w:hAnsi="Times New Roman"/>
+                <w:sz w:val="17"/>
+              </w:rPr>
+              <w:t>$2.2m</w:t>
+            </w:r>
+          </w:p>
+        </w:tc>
+        <w:tc>
+          <w:tcPr>
+            <w:tcW w:type="dxa" w:w="1134"/>
+          </w:tcPr>
+          <w:p>
+            <w:pPr>
+              <w:jc w:val="center"/>
+            </w:pPr>
+            <w:r/>
+            <w:r>
+              <w:rPr>
+                <w:rFonts w:ascii="Times New Roman" w:hAnsi="Times New Roman"/>
+                <w:sz w:val="17"/>
+              </w:rPr>
+              <w:t>$9.0m</w:t>
+            </w:r>
+          </w:p>
+        </w:tc>
+        <w:tc>
+          <w:tcPr>
+            <w:tcW w:type="dxa" w:w="1134"/>
+          </w:tcPr>
+          <w:p>
+            <w:pPr>
+              <w:jc w:val="center"/>
+            </w:pPr>
+            <w:r/>
+            <w:r>
+              <w:rPr>
+                <w:rFonts w:ascii="Times New Roman" w:hAnsi="Times New Roman"/>
+                <w:sz w:val="17"/>
+              </w:rPr>
+              <w:t>$22.5m</w:t>
+            </w:r>
+          </w:p>
+        </w:tc>
+        <w:tc>
+          <w:tcPr>
+            <w:tcW w:type="dxa" w:w="1134"/>
+          </w:tcPr>
+          <w:p>
+            <w:pPr>
+              <w:jc w:val="center"/>
+            </w:pPr>
+            <w:r/>
+            <w:r>
+              <w:rPr>
+                <w:rFonts w:ascii="Times New Roman" w:hAnsi="Times New Roman"/>
+                <w:sz w:val="17"/>
+              </w:rPr>
+              <w:t>$45.0m</w:t>
+            </w:r>
+          </w:p>
+        </w:tc>
+        <w:tc>
+          <w:tcPr>
+            <w:tcW w:type="dxa" w:w="1134"/>
+          </w:tcPr>
+          <w:p>
+            <w:pPr>
+              <w:jc w:val="center"/>
+            </w:pPr>
+            <w:r/>
+            <w:r>
+              <w:rPr>
+                <w:rFonts w:ascii="Times New Roman" w:hAnsi="Times New Roman"/>
+                <w:sz w:val="17"/>
+              </w:rPr>
+              <w:t>$225.0m</w:t>
+            </w:r>
+          </w:p>
+        </w:tc>
+        <w:tc>
+          <w:tcPr>
+            <w:tcW w:type="dxa" w:w="1134"/>
+          </w:tcPr>
+          <w:p>
+            <w:pPr>
+              <w:jc w:val="left"/>
+            </w:pPr>
+            <w:r/>
+            <w:r>
+              <w:rPr>
+                <w:rFonts w:ascii="Times New Roman" w:hAnsi="Times New Roman"/>
+                <w:sz w:val="17"/>
+              </w:rPr>
+              <w:t>$450.0m</w:t>
+            </w:r>
+          </w:p>
+        </w:tc>
+      </w:tr>
+      <w:tr>
+        <w:tc>
+          <w:tcPr>
+            <w:tcW w:type="dxa" w:w="1984"/>
+          </w:tcPr>
+          <w:p>
+            <w:pPr>
+              <w:jc w:val="center"/>
+            </w:pPr>
+            <w:r/>
+            <w:r>
+              <w:rPr>
+                <w:rFonts w:ascii="Times New Roman" w:hAnsi="Times New Roman"/>
+                <w:sz w:val="17"/>
+              </w:rPr>
+              <w:t>Gini-minimum (2.5%, 3%)</w:t>
+            </w:r>
+          </w:p>
+        </w:tc>
+        <w:tc>
+          <w:tcPr>
+            <w:tcW w:type="dxa" w:w="850"/>
+          </w:tcPr>
+          <w:p>
+            <w:pPr>
+              <w:jc w:val="center"/>
+            </w:pPr>
+            <w:r/>
+            <w:r>
+              <w:rPr>
+                <w:rFonts w:ascii="Times New Roman" w:hAnsi="Times New Roman"/>
+                <w:sz w:val="17"/>
+              </w:rPr>
+              <w:t>5.5%</w:t>
+            </w:r>
+          </w:p>
+        </w:tc>
+        <w:tc>
+          <w:tcPr>
+            <w:tcW w:type="dxa" w:w="1134"/>
+          </w:tcPr>
+          <w:p>
+            <w:pPr>
+              <w:jc w:val="center"/>
+            </w:pPr>
+            <w:r/>
+            <w:r>
+              <w:rPr>
+                <w:rFonts w:ascii="Times New Roman" w:hAnsi="Times New Roman"/>
+                <w:sz w:val="17"/>
+              </w:rPr>
+              <w:t>$2.8m</w:t>
+            </w:r>
+          </w:p>
+        </w:tc>
+        <w:tc>
+          <w:tcPr>
+            <w:tcW w:type="dxa" w:w="1134"/>
+          </w:tcPr>
+          <w:p>
+            <w:pPr>
+              <w:jc w:val="center"/>
+            </w:pPr>
+            <w:r/>
+            <w:r>
+              <w:rPr>
+                <w:rFonts w:ascii="Times New Roman" w:hAnsi="Times New Roman"/>
+                <w:sz w:val="17"/>
+              </w:rPr>
+              <w:t>$11.0m</w:t>
+            </w:r>
+          </w:p>
+        </w:tc>
+        <w:tc>
+          <w:tcPr>
+            <w:tcW w:type="dxa" w:w="1134"/>
+          </w:tcPr>
+          <w:p>
+            <w:pPr>
+              <w:jc w:val="center"/>
+            </w:pPr>
+            <w:r/>
+            <w:r>
+              <w:rPr>
+                <w:rFonts w:ascii="Times New Roman" w:hAnsi="Times New Roman"/>
+                <w:sz w:val="17"/>
+              </w:rPr>
+              <w:t>$27.5m</w:t>
+            </w:r>
+          </w:p>
+        </w:tc>
+        <w:tc>
+          <w:tcPr>
+            <w:tcW w:type="dxa" w:w="1134"/>
+          </w:tcPr>
+          <w:p>
+            <w:pPr>
+              <w:jc w:val="center"/>
+            </w:pPr>
+            <w:r/>
+            <w:r>
+              <w:rPr>
+                <w:rFonts w:ascii="Times New Roman" w:hAnsi="Times New Roman"/>
+                <w:sz w:val="17"/>
+              </w:rPr>
+              <w:t>$55.0m</w:t>
+            </w:r>
+          </w:p>
+        </w:tc>
+        <w:tc>
+          <w:tcPr>
+            <w:tcW w:type="dxa" w:w="1134"/>
+          </w:tcPr>
+          <w:p>
+            <w:pPr>
+              <w:jc w:val="center"/>
+            </w:pPr>
+            <w:r/>
+            <w:r>
+              <w:rPr>
+                <w:rFonts w:ascii="Times New Roman" w:hAnsi="Times New Roman"/>
+                <w:sz w:val="17"/>
+              </w:rPr>
+              <w:t>$275.0m</w:t>
+            </w:r>
+          </w:p>
+        </w:tc>
+        <w:tc>
+          <w:tcPr>
+            <w:tcW w:type="dxa" w:w="1134"/>
+          </w:tcPr>
+          <w:p>
+            <w:pPr>
+              <w:jc w:val="left"/>
+            </w:pPr>
+            <w:r/>
+            <w:r>
+              <w:rPr>
+                <w:rFonts w:ascii="Times New Roman" w:hAnsi="Times New Roman"/>
+                <w:sz w:val="17"/>
+              </w:rPr>
+              <w:t>$550.0m</w:t>
+            </w:r>
+          </w:p>
+        </w:tc>
+      </w:tr>
+      <w:tr>
+        <w:tc>
+          <w:tcPr>
+            <w:tcW w:type="dxa" w:w="1984"/>
+          </w:tcPr>
+          <w:p>
+            <w:pPr>
+              <w:jc w:val="center"/>
+            </w:pPr>
+            <w:r/>
+            <w:r>
+              <w:rPr>
+                <w:rFonts w:ascii="Times New Roman" w:hAnsi="Times New Roman"/>
+                <w:sz w:val="17"/>
+              </w:rPr>
+              <w:t>Band-order boundary (3.0%, 3%)</w:t>
+            </w:r>
+          </w:p>
+        </w:tc>
+        <w:tc>
+          <w:tcPr>
+            <w:tcW w:type="dxa" w:w="850"/>
+          </w:tcPr>
+          <w:p>
+            <w:pPr>
+              <w:jc w:val="center"/>
+            </w:pPr>
+            <w:r/>
+            <w:r>
+              <w:rPr>
+                <w:rFonts w:ascii="Times New Roman" w:hAnsi="Times New Roman"/>
+                <w:sz w:val="17"/>
+              </w:rPr>
+              <w:t>6.0%</w:t>
+            </w:r>
+          </w:p>
+        </w:tc>
+        <w:tc>
+          <w:tcPr>
+            <w:tcW w:type="dxa" w:w="1134"/>
+          </w:tcPr>
+          <w:p>
+            <w:pPr>
+              <w:jc w:val="center"/>
+            </w:pPr>
+            <w:r/>
+            <w:r>
+              <w:rPr>
+                <w:rFonts w:ascii="Times New Roman" w:hAnsi="Times New Roman"/>
+                <w:sz w:val="17"/>
+              </w:rPr>
+              <w:t>$3.0m</w:t>
+            </w:r>
+          </w:p>
+        </w:tc>
+        <w:tc>
+          <w:tcPr>
+            <w:tcW w:type="dxa" w:w="1134"/>
+          </w:tcPr>
+          <w:p>
+            <w:pPr>
+              <w:jc w:val="center"/>
+            </w:pPr>
+            <w:r/>
+            <w:r>
+              <w:rPr>
+                <w:rFonts w:ascii="Times New Roman" w:hAnsi="Times New Roman"/>
+                <w:sz w:val="17"/>
+              </w:rPr>
+              <w:t>$12.0m</w:t>
+            </w:r>
+          </w:p>
+        </w:tc>
+        <w:tc>
+          <w:tcPr>
+            <w:tcW w:type="dxa" w:w="1134"/>
+          </w:tcPr>
+          <w:p>
+            <w:pPr>
+              <w:jc w:val="center"/>
+            </w:pPr>
+            <w:r/>
+            <w:r>
+              <w:rPr>
+                <w:rFonts w:ascii="Times New Roman" w:hAnsi="Times New Roman"/>
+                <w:sz w:val="17"/>
+              </w:rPr>
+              <w:t>$30.0m</w:t>
+            </w:r>
+          </w:p>
+        </w:tc>
+        <w:tc>
+          <w:tcPr>
+            <w:tcW w:type="dxa" w:w="1134"/>
+          </w:tcPr>
+          <w:p>
+            <w:pPr>
+              <w:jc w:val="center"/>
+            </w:pPr>
+            <w:r/>
+            <w:r>
+              <w:rPr>
+                <w:rFonts w:ascii="Times New Roman" w:hAnsi="Times New Roman"/>
+                <w:sz w:val="17"/>
+              </w:rPr>
+              <w:t>$60.0m</w:t>
+            </w:r>
+          </w:p>
+        </w:tc>
+        <w:tc>
+          <w:tcPr>
+            <w:tcW w:type="dxa" w:w="1134"/>
+          </w:tcPr>
+          <w:p>
+            <w:pPr>
+              <w:jc w:val="center"/>
+            </w:pPr>
+            <w:r/>
+            <w:r>
+              <w:rPr>
+                <w:rFonts w:ascii="Times New Roman" w:hAnsi="Times New Roman"/>
+                <w:sz w:val="17"/>
+              </w:rPr>
+              <w:t>$300.0m</w:t>
+            </w:r>
+          </w:p>
+        </w:tc>
+        <w:tc>
+          <w:tcPr>
+            <w:tcW w:type="dxa" w:w="1134"/>
+          </w:tcPr>
+          <w:p>
+            <w:pPr>
+              <w:jc w:val="left"/>
+            </w:pPr>
+            <w:r/>
+            <w:r>
+              <w:rPr>
+                <w:rFonts w:ascii="Times New Roman" w:hAnsi="Times New Roman"/>
+                <w:sz w:val="17"/>
+              </w:rPr>
+              <w:t>$600.0m</w:t>
+            </w:r>
+          </w:p>
+        </w:tc>
+      </w:tr>
+    </w:tbl>
+    <w:p>
+      <w:pPr>
+        <w:jc w:val="center"/>
+      </w:pPr>
+      <w:r>
+        <w:rPr>
+          <w:rFonts w:ascii="Times New Roman" w:hAnsi="Times New Roman"/>
+          <w:i/>
+          <w:sz w:val="17"/>
+        </w:rPr>
+        <w:t>Table E2. Total stewardship pool (TSAC + SOSAC) by balance point and fund size</w:t>
+      </w:r>
+    </w:p>
+    <w:p>
+      <w:pPr>
         <w:spacing w:after="240"/>
       </w:pPr>
       <w:r>
-        <w:t>In considering these balance points it is important to calculate the volume of funds that are being allocated for IUSAF and TSAC and SOSAC. Under a US$1 billion fund 93.5–95.5% ($935–955m) will be stably allocated under the IUSAF. The amount under consideration for allocation under the three balance point scenarios is 4.5–6.5% of the Cali Fund or $45–65 million. Under these scenarios for 142 developing country Parties the vast majority would see reallocations of less than $0.5 million. As such, if IUSAF is accepted as the stable baseline, the question for consideration by Parties would be how to allocate the $45–65 million stewardship pool. Note that the size of the stewardship pool will scale in accordance with the overall size of the Cali Fund.</w:t>
+        <w:t>These tables confirm that regardless of fund size, the IUSAF equity base accounts for 93.5–95.5% of the Cali Fund and the stewardship pool is 4.5–6.5%. At the most likely fund sizes under discussion ($200m–$1bn), the stewardship pool ranges from $9m to $55m at the Gini-minimum, and from $9m to $60m at the band-order boundary.</w:t>
       </w:r>
     </w:p>
     <w:p>

</xml_diff>